<commit_message>
Restore Army Cyber motivation dedication and acknowledgments in praxis
</commit_message>
<xml_diff>
--- a/paper/working-praxis-20261024/Identifying_Autonomous_AI_APT_Working_Praxis.docx
+++ b/paper/working-praxis-20261024/Identifying_Autonomous_AI_APT_Working_Praxis.docx
@@ -119,7 +119,7 @@
       <w:pPr>
         <w:pStyle w:val="Heading1"/>
       </w:pPr>
-      <w:bookmarkStart w:id="0" w:name="_Toc243744353"/>
+      <w:bookmarkStart w:id="0" w:name="_Toc243745000"/>
       <w:r>
         <w:t>Certification Pending</w:t>
       </w:r>
@@ -173,7 +173,7 @@
       <w:pPr>
         <w:pStyle w:val="Heading2"/>
       </w:pPr>
-      <w:bookmarkStart w:id="1" w:name="_Toc243744354"/>
+      <w:bookmarkStart w:id="1" w:name="_Toc243745001"/>
       <w:r>
         <w:t>Draft Use and Evidence Convention</w:t>
       </w:r>
@@ -198,11 +198,71 @@
       <w:pPr>
         <w:pStyle w:val="Heading1"/>
       </w:pPr>
-      <w:bookmarkStart w:id="2" w:name="_Toc243744355"/>
+      <w:bookmarkStart w:id="2" w:name="_Toc243745002"/>
+      <w:r>
+        <w:t>Dedication</w:t>
+      </w:r>
+      <w:bookmarkEnd w:id="2"/>
+    </w:p>
+    <w:p>
+      <w:r>
+        <w:t>I dedicate this Praxis to my wife, Tristian Pagan, whose love, support and encouragement sustain me throughout this work. To my children, who are a constant source of inspiration and motivation, and to my mother and brother, who taught me the value of hard work and perseverance. To my cousin, Janine Fuentes, who always makes me smile.</w:t>
+      </w:r>
+    </w:p>
+    <w:p>
+      <w:r>
+        <w:t>I am deeply grateful to Dr. Matthew Morris for his unwavering support and encouragement. I also thank my professors at The George Washington University, particularly Dr. Jonathan Ng, whose guidance and mentorship have shaped my academic journey.</w:t>
+      </w:r>
+    </w:p>
+    <w:p>
+      <w:r>
+        <w:t>This work reflects the support, encouragement and wisdom of those who have believed in me.</w:t>
+      </w:r>
+    </w:p>
+    <w:p>
+      <w:r>
+        <w:br w:type="page"/>
+      </w:r>
+    </w:p>
+    <w:p>
+      <w:pPr>
+        <w:pStyle w:val="Heading1"/>
+      </w:pPr>
+      <w:bookmarkStart w:id="3" w:name="_Toc243745003"/>
+      <w:r>
+        <w:t>Acknowledgments</w:t>
+      </w:r>
+      <w:bookmarkEnd w:id="3"/>
+    </w:p>
+    <w:p>
+      <w:r>
+        <w:t>I thank Dr. Jacob Ulrich, Dan Le, Richard Scher, Alane Lim and, especially, Marcos Malvido for their support of the research and development that have contributed to this work. Their guidance, resources and encouragement have helped me work through difficult research and engineering problems.</w:t>
+      </w:r>
+    </w:p>
+    <w:p>
+      <w:r>
+        <w:t>I also extend my sincere appreciation to Dr. Phillip Reed and Austin Welborn for their support and contributions to this Praxis. I am grateful for the time and commitment they have shared as this research develops.</w:t>
+      </w:r>
+    </w:p>
+    <w:p>
+      <w:r>
+        <w:t>I appreciate everyone who has supported my effort to connect academic research with the practical needs of cyber defenders. Their support continues to motivate this work as the experiment, analysis and manuscript progress toward completion.</w:t>
+      </w:r>
+    </w:p>
+    <w:p>
+      <w:r>
+        <w:br w:type="page"/>
+      </w:r>
+    </w:p>
+    <w:p>
+      <w:pPr>
+        <w:pStyle w:val="Heading1"/>
+      </w:pPr>
+      <w:bookmarkStart w:id="4" w:name="_Toc243745004"/>
       <w:r>
         <w:t>Abstract of Praxis</w:t>
       </w:r>
-      <w:bookmarkEnd w:id="2"/>
+      <w:bookmarkEnd w:id="4"/>
     </w:p>
     <w:p>
       <w:pPr>
@@ -246,11 +306,11 @@
       <w:pPr>
         <w:pStyle w:val="Heading1"/>
       </w:pPr>
-      <w:bookmarkStart w:id="3" w:name="_Toc243744356"/>
+      <w:bookmarkStart w:id="5" w:name="_Toc243745005"/>
       <w:r>
         <w:t>Table of Contents</w:t>
       </w:r>
-      <w:bookmarkEnd w:id="3"/>
+      <w:bookmarkEnd w:id="5"/>
     </w:p>
     <w:p>
       <w:pPr>
@@ -273,7 +333,7 @@
       <w:r>
         <w:fldChar w:fldCharType="separate"/>
       </w:r>
-      <w:hyperlink w:anchor="_Toc243744353" w:history="1">
+      <w:hyperlink w:anchor="_Toc243745000" w:history="1">
         <w:r>
           <w:rPr>
             <w:rStyle w:val="Hyperlink"/>
@@ -296,7 +356,7 @@
           <w:rPr>
             <w:webHidden/>
           </w:rPr>
-          <w:instrText xml:space="preserve"> PAGEREF _Toc243744353 \h </w:instrText>
+          <w:instrText xml:space="preserve"> PAGEREF _Toc243745000 \h </w:instrText>
         </w:r>
         <w:r>
           <w:rPr>
@@ -336,7 +396,7 @@
           <w14:ligatures w14:val="standardContextual"/>
         </w:rPr>
       </w:pPr>
-      <w:hyperlink w:anchor="_Toc243744354" w:history="1">
+      <w:hyperlink w:anchor="_Toc243745001" w:history="1">
         <w:r>
           <w:rPr>
             <w:rStyle w:val="Hyperlink"/>
@@ -363,7 +423,7 @@
             <w:noProof/>
             <w:webHidden/>
           </w:rPr>
-          <w:instrText xml:space="preserve"> PAGEREF _Toc243744354 \h </w:instrText>
+          <w:instrText xml:space="preserve"> PAGEREF _Toc243745001 \h </w:instrText>
         </w:r>
         <w:r>
           <w:rPr>
@@ -406,12 +466,12 @@
           <w14:ligatures w14:val="standardContextual"/>
         </w:rPr>
       </w:pPr>
-      <w:hyperlink w:anchor="_Toc243744355" w:history="1">
+      <w:hyperlink w:anchor="_Toc243745002" w:history="1">
         <w:r>
           <w:rPr>
             <w:rStyle w:val="Hyperlink"/>
           </w:rPr>
-          <w:t>Abstract of Praxis</w:t>
+          <w:t>Dedication</w:t>
         </w:r>
         <w:r>
           <w:rPr>
@@ -429,7 +489,7 @@
           <w:rPr>
             <w:webHidden/>
           </w:rPr>
-          <w:instrText xml:space="preserve"> PAGEREF _Toc243744355 \h </w:instrText>
+          <w:instrText xml:space="preserve"> PAGEREF _Toc243745002 \h </w:instrText>
         </w:r>
         <w:r>
           <w:rPr>
@@ -468,12 +528,12 @@
           <w14:ligatures w14:val="standardContextual"/>
         </w:rPr>
       </w:pPr>
-      <w:hyperlink w:anchor="_Toc243744356" w:history="1">
+      <w:hyperlink w:anchor="_Toc243745003" w:history="1">
         <w:r>
           <w:rPr>
             <w:rStyle w:val="Hyperlink"/>
           </w:rPr>
-          <w:t>Table of Contents</w:t>
+          <w:t>Acknowledgments</w:t>
         </w:r>
         <w:r>
           <w:rPr>
@@ -491,7 +551,7 @@
           <w:rPr>
             <w:webHidden/>
           </w:rPr>
-          <w:instrText xml:space="preserve"> PAGEREF _Toc243744356 \h </w:instrText>
+          <w:instrText xml:space="preserve"> PAGEREF _Toc243745003 \h </w:instrText>
         </w:r>
         <w:r>
           <w:rPr>
@@ -530,12 +590,12 @@
           <w14:ligatures w14:val="standardContextual"/>
         </w:rPr>
       </w:pPr>
-      <w:hyperlink w:anchor="_Toc243744357" w:history="1">
+      <w:hyperlink w:anchor="_Toc243745004" w:history="1">
         <w:r>
           <w:rPr>
             <w:rStyle w:val="Hyperlink"/>
           </w:rPr>
-          <w:t>List of Figures</w:t>
+          <w:t>Abstract of Praxis</w:t>
         </w:r>
         <w:r>
           <w:rPr>
@@ -553,7 +613,7 @@
           <w:rPr>
             <w:webHidden/>
           </w:rPr>
-          <w:instrText xml:space="preserve"> PAGEREF _Toc243744357 \h </w:instrText>
+          <w:instrText xml:space="preserve"> PAGEREF _Toc243745004 \h </w:instrText>
         </w:r>
         <w:r>
           <w:rPr>
@@ -570,7 +630,7 @@
           <w:rPr>
             <w:webHidden/>
           </w:rPr>
-          <w:t>vii</w:t>
+          <w:t>vi</w:t>
         </w:r>
         <w:r>
           <w:rPr>
@@ -592,12 +652,12 @@
           <w14:ligatures w14:val="standardContextual"/>
         </w:rPr>
       </w:pPr>
-      <w:hyperlink w:anchor="_Toc243744358" w:history="1">
+      <w:hyperlink w:anchor="_Toc243745005" w:history="1">
         <w:r>
           <w:rPr>
             <w:rStyle w:val="Hyperlink"/>
           </w:rPr>
-          <w:t>List of Tables</w:t>
+          <w:t>Table of Contents</w:t>
         </w:r>
         <w:r>
           <w:rPr>
@@ -615,7 +675,7 @@
           <w:rPr>
             <w:webHidden/>
           </w:rPr>
-          <w:instrText xml:space="preserve"> PAGEREF _Toc243744358 \h </w:instrText>
+          <w:instrText xml:space="preserve"> PAGEREF _Toc243745005 \h </w:instrText>
         </w:r>
         <w:r>
           <w:rPr>
@@ -654,12 +714,12 @@
           <w14:ligatures w14:val="standardContextual"/>
         </w:rPr>
       </w:pPr>
-      <w:hyperlink w:anchor="_Toc243744359" w:history="1">
+      <w:hyperlink w:anchor="_Toc243745006" w:history="1">
         <w:r>
           <w:rPr>
             <w:rStyle w:val="Hyperlink"/>
           </w:rPr>
-          <w:t>List of Symbols and Acronyms</w:t>
+          <w:t>List of Figures</w:t>
         </w:r>
         <w:r>
           <w:rPr>
@@ -677,7 +737,7 @@
           <w:rPr>
             <w:webHidden/>
           </w:rPr>
-          <w:instrText xml:space="preserve"> PAGEREF _Toc243744359 \h </w:instrText>
+          <w:instrText xml:space="preserve"> PAGEREF _Toc243745006 \h </w:instrText>
         </w:r>
         <w:r>
           <w:rPr>
@@ -694,7 +754,7 @@
           <w:rPr>
             <w:webHidden/>
           </w:rPr>
-          <w:t>viii</w:t>
+          <w:t>ix</w:t>
         </w:r>
         <w:r>
           <w:rPr>
@@ -716,11 +776,135 @@
           <w14:ligatures w14:val="standardContextual"/>
         </w:rPr>
       </w:pPr>
-      <w:hyperlink w:anchor="_Toc243744360" w:history="1">
+      <w:hyperlink w:anchor="_Toc243745007" w:history="1">
         <w:r>
           <w:rPr>
             <w:rStyle w:val="Hyperlink"/>
           </w:rPr>
+          <w:t>List of Tables</w:t>
+        </w:r>
+        <w:r>
+          <w:rPr>
+            <w:webHidden/>
+          </w:rPr>
+          <w:tab/>
+        </w:r>
+        <w:r>
+          <w:rPr>
+            <w:webHidden/>
+          </w:rPr>
+          <w:fldChar w:fldCharType="begin"/>
+        </w:r>
+        <w:r>
+          <w:rPr>
+            <w:webHidden/>
+          </w:rPr>
+          <w:instrText xml:space="preserve"> PAGEREF _Toc243745007 \h </w:instrText>
+        </w:r>
+        <w:r>
+          <w:rPr>
+            <w:webHidden/>
+          </w:rPr>
+        </w:r>
+        <w:r>
+          <w:rPr>
+            <w:webHidden/>
+          </w:rPr>
+          <w:fldChar w:fldCharType="separate"/>
+        </w:r>
+        <w:r>
+          <w:rPr>
+            <w:webHidden/>
+          </w:rPr>
+          <w:t>ix</w:t>
+        </w:r>
+        <w:r>
+          <w:rPr>
+            <w:webHidden/>
+          </w:rPr>
+          <w:fldChar w:fldCharType="end"/>
+        </w:r>
+      </w:hyperlink>
+    </w:p>
+    <w:p>
+      <w:pPr>
+        <w:pStyle w:val="TOC1"/>
+        <w:rPr>
+          <w:rFonts w:asciiTheme="minorHAnsi" w:eastAsiaTheme="minorEastAsia" w:hAnsiTheme="minorHAnsi" w:cstheme="minorBidi"/>
+          <w:color w:val="auto"/>
+          <w:kern w:val="2"/>
+          <w:sz w:val="24"/>
+          <w:szCs w:val="24"/>
+          <w14:ligatures w14:val="standardContextual"/>
+        </w:rPr>
+      </w:pPr>
+      <w:hyperlink w:anchor="_Toc243745008" w:history="1">
+        <w:r>
+          <w:rPr>
+            <w:rStyle w:val="Hyperlink"/>
+          </w:rPr>
+          <w:t>List of Symbols and Acronyms</w:t>
+        </w:r>
+        <w:r>
+          <w:rPr>
+            <w:webHidden/>
+          </w:rPr>
+          <w:tab/>
+        </w:r>
+        <w:r>
+          <w:rPr>
+            <w:webHidden/>
+          </w:rPr>
+          <w:fldChar w:fldCharType="begin"/>
+        </w:r>
+        <w:r>
+          <w:rPr>
+            <w:webHidden/>
+          </w:rPr>
+          <w:instrText xml:space="preserve"> PAGEREF _Toc243745008 \h </w:instrText>
+        </w:r>
+        <w:r>
+          <w:rPr>
+            <w:webHidden/>
+          </w:rPr>
+        </w:r>
+        <w:r>
+          <w:rPr>
+            <w:webHidden/>
+          </w:rPr>
+          <w:fldChar w:fldCharType="separate"/>
+        </w:r>
+        <w:r>
+          <w:rPr>
+            <w:webHidden/>
+          </w:rPr>
+          <w:t>x</w:t>
+        </w:r>
+        <w:r>
+          <w:rPr>
+            <w:webHidden/>
+          </w:rPr>
+          <w:fldChar w:fldCharType="end"/>
+        </w:r>
+      </w:hyperlink>
+    </w:p>
+    <w:p>
+      <w:pPr>
+        <w:pStyle w:val="TOC1"/>
+        <w:rPr>
+          <w:rFonts w:asciiTheme="minorHAnsi" w:eastAsiaTheme="minorEastAsia" w:hAnsiTheme="minorHAnsi" w:cstheme="minorBidi"/>
+          <w:color w:val="auto"/>
+          <w:kern w:val="2"/>
+          <w:sz w:val="24"/>
+          <w:szCs w:val="24"/>
+          <w14:ligatures w14:val="standardContextual"/>
+        </w:rPr>
+      </w:pPr>
+      <w:hyperlink w:anchor="_Toc243745009" w:history="1">
+        <w:r>
+          <w:rPr>
+            <w:rStyle w:val="Hyperlink"/>
+          </w:rPr>
           <w:t>Chapter 1 Introduction</w:t>
         </w:r>
         <w:r>
@@ -739,7 +923,7 @@
           <w:rPr>
             <w:webHidden/>
           </w:rPr>
-          <w:instrText xml:space="preserve"> PAGEREF _Toc243744360 \h </w:instrText>
+          <w:instrText xml:space="preserve"> PAGEREF _Toc243745009 \h </w:instrText>
         </w:r>
         <w:r>
           <w:rPr>
@@ -779,7 +963,7 @@
           <w14:ligatures w14:val="standardContextual"/>
         </w:rPr>
       </w:pPr>
-      <w:hyperlink w:anchor="_Toc243744361" w:history="1">
+      <w:hyperlink w:anchor="_Toc243745010" w:history="1">
         <w:r>
           <w:rPr>
             <w:rStyle w:val="Hyperlink"/>
@@ -806,7 +990,7 @@
             <w:noProof/>
             <w:webHidden/>
           </w:rPr>
-          <w:instrText xml:space="preserve"> PAGEREF _Toc243744361 \h </w:instrText>
+          <w:instrText xml:space="preserve"> PAGEREF _Toc243745010 \h </w:instrText>
         </w:r>
         <w:r>
           <w:rPr>
@@ -850,7 +1034,7 @@
           <w14:ligatures w14:val="standardContextual"/>
         </w:rPr>
       </w:pPr>
-      <w:hyperlink w:anchor="_Toc243744362" w:history="1">
+      <w:hyperlink w:anchor="_Toc243745011" w:history="1">
         <w:r>
           <w:rPr>
             <w:rStyle w:val="Hyperlink"/>
@@ -877,7 +1061,7 @@
             <w:noProof/>
             <w:webHidden/>
           </w:rPr>
-          <w:instrText xml:space="preserve"> PAGEREF _Toc243744362 \h </w:instrText>
+          <w:instrText xml:space="preserve"> PAGEREF _Toc243745011 \h </w:instrText>
         </w:r>
         <w:r>
           <w:rPr>
@@ -921,7 +1105,7 @@
           <w14:ligatures w14:val="standardContextual"/>
         </w:rPr>
       </w:pPr>
-      <w:hyperlink w:anchor="_Toc243744363" w:history="1">
+      <w:hyperlink w:anchor="_Toc243745012" w:history="1">
         <w:r>
           <w:rPr>
             <w:rStyle w:val="Hyperlink"/>
@@ -948,7 +1132,7 @@
             <w:noProof/>
             <w:webHidden/>
           </w:rPr>
-          <w:instrText xml:space="preserve"> PAGEREF _Toc243744363 \h </w:instrText>
+          <w:instrText xml:space="preserve"> PAGEREF _Toc243745012 \h </w:instrText>
         </w:r>
         <w:r>
           <w:rPr>
@@ -968,7 +1152,7 @@
             <w:noProof/>
             <w:webHidden/>
           </w:rPr>
-          <w:t>1</w:t>
+          <w:t>2</w:t>
         </w:r>
         <w:r>
           <w:rPr>
@@ -992,7 +1176,7 @@
           <w14:ligatures w14:val="standardContextual"/>
         </w:rPr>
       </w:pPr>
-      <w:hyperlink w:anchor="_Toc243744364" w:history="1">
+      <w:hyperlink w:anchor="_Toc243745013" w:history="1">
         <w:r>
           <w:rPr>
             <w:rStyle w:val="Hyperlink"/>
@@ -1019,7 +1203,7 @@
             <w:noProof/>
             <w:webHidden/>
           </w:rPr>
-          <w:instrText xml:space="preserve"> PAGEREF _Toc243744364 \h </w:instrText>
+          <w:instrText xml:space="preserve"> PAGEREF _Toc243745013 \h </w:instrText>
         </w:r>
         <w:r>
           <w:rPr>
@@ -1039,7 +1223,7 @@
             <w:noProof/>
             <w:webHidden/>
           </w:rPr>
-          <w:t>1</w:t>
+          <w:t>2</w:t>
         </w:r>
         <w:r>
           <w:rPr>
@@ -1063,7 +1247,7 @@
           <w14:ligatures w14:val="standardContextual"/>
         </w:rPr>
       </w:pPr>
-      <w:hyperlink w:anchor="_Toc243744365" w:history="1">
+      <w:hyperlink w:anchor="_Toc243745014" w:history="1">
         <w:r>
           <w:rPr>
             <w:rStyle w:val="Hyperlink"/>
@@ -1090,7 +1274,7 @@
             <w:noProof/>
             <w:webHidden/>
           </w:rPr>
-          <w:instrText xml:space="preserve"> PAGEREF _Toc243744365 \h </w:instrText>
+          <w:instrText xml:space="preserve"> PAGEREF _Toc243745014 \h </w:instrText>
         </w:r>
         <w:r>
           <w:rPr>
@@ -1110,7 +1294,7 @@
             <w:noProof/>
             <w:webHidden/>
           </w:rPr>
-          <w:t>2</w:t>
+          <w:t>3</w:t>
         </w:r>
         <w:r>
           <w:rPr>
@@ -1134,7 +1318,7 @@
           <w14:ligatures w14:val="standardContextual"/>
         </w:rPr>
       </w:pPr>
-      <w:hyperlink w:anchor="_Toc243744366" w:history="1">
+      <w:hyperlink w:anchor="_Toc243745015" w:history="1">
         <w:r>
           <w:rPr>
             <w:rStyle w:val="Hyperlink"/>
@@ -1161,7 +1345,7 @@
             <w:noProof/>
             <w:webHidden/>
           </w:rPr>
-          <w:instrText xml:space="preserve"> PAGEREF _Toc243744366 \h </w:instrText>
+          <w:instrText xml:space="preserve"> PAGEREF _Toc243745015 \h </w:instrText>
         </w:r>
         <w:r>
           <w:rPr>
@@ -1181,7 +1365,7 @@
             <w:noProof/>
             <w:webHidden/>
           </w:rPr>
-          <w:t>2</w:t>
+          <w:t>3</w:t>
         </w:r>
         <w:r>
           <w:rPr>
@@ -1205,7 +1389,7 @@
           <w14:ligatures w14:val="standardContextual"/>
         </w:rPr>
       </w:pPr>
-      <w:hyperlink w:anchor="_Toc243744367" w:history="1">
+      <w:hyperlink w:anchor="_Toc243745016" w:history="1">
         <w:r>
           <w:rPr>
             <w:rStyle w:val="Hyperlink"/>
@@ -1232,7 +1416,7 @@
             <w:noProof/>
             <w:webHidden/>
           </w:rPr>
-          <w:instrText xml:space="preserve"> PAGEREF _Toc243744367 \h </w:instrText>
+          <w:instrText xml:space="preserve"> PAGEREF _Toc243745016 \h </w:instrText>
         </w:r>
         <w:r>
           <w:rPr>
@@ -1252,7 +1436,7 @@
             <w:noProof/>
             <w:webHidden/>
           </w:rPr>
-          <w:t>3</w:t>
+          <w:t>4</w:t>
         </w:r>
         <w:r>
           <w:rPr>
@@ -1276,7 +1460,7 @@
           <w14:ligatures w14:val="standardContextual"/>
         </w:rPr>
       </w:pPr>
-      <w:hyperlink w:anchor="_Toc243744368" w:history="1">
+      <w:hyperlink w:anchor="_Toc243745017" w:history="1">
         <w:r>
           <w:rPr>
             <w:rStyle w:val="Hyperlink"/>
@@ -1303,7 +1487,7 @@
             <w:noProof/>
             <w:webHidden/>
           </w:rPr>
-          <w:instrText xml:space="preserve"> PAGEREF _Toc243744368 \h </w:instrText>
+          <w:instrText xml:space="preserve"> PAGEREF _Toc243745017 \h </w:instrText>
         </w:r>
         <w:r>
           <w:rPr>
@@ -1323,7 +1507,7 @@
             <w:noProof/>
             <w:webHidden/>
           </w:rPr>
-          <w:t>3</w:t>
+          <w:t>4</w:t>
         </w:r>
         <w:r>
           <w:rPr>
@@ -1347,7 +1531,7 @@
           <w14:ligatures w14:val="standardContextual"/>
         </w:rPr>
       </w:pPr>
-      <w:hyperlink w:anchor="_Toc243744369" w:history="1">
+      <w:hyperlink w:anchor="_Toc243745018" w:history="1">
         <w:r>
           <w:rPr>
             <w:rStyle w:val="Hyperlink"/>
@@ -1374,7 +1558,7 @@
             <w:noProof/>
             <w:webHidden/>
           </w:rPr>
-          <w:instrText xml:space="preserve"> PAGEREF _Toc243744369 \h </w:instrText>
+          <w:instrText xml:space="preserve"> PAGEREF _Toc243745018 \h </w:instrText>
         </w:r>
         <w:r>
           <w:rPr>
@@ -1394,7 +1578,7 @@
             <w:noProof/>
             <w:webHidden/>
           </w:rPr>
-          <w:t>3</w:t>
+          <w:t>4</w:t>
         </w:r>
         <w:r>
           <w:rPr>
@@ -1417,7 +1601,7 @@
           <w14:ligatures w14:val="standardContextual"/>
         </w:rPr>
       </w:pPr>
-      <w:hyperlink w:anchor="_Toc243744370" w:history="1">
+      <w:hyperlink w:anchor="_Toc243745019" w:history="1">
         <w:r>
           <w:rPr>
             <w:rStyle w:val="Hyperlink"/>
@@ -1440,7 +1624,7 @@
           <w:rPr>
             <w:webHidden/>
           </w:rPr>
-          <w:instrText xml:space="preserve"> PAGEREF _Toc243744370 \h </w:instrText>
+          <w:instrText xml:space="preserve"> PAGEREF _Toc243745019 \h </w:instrText>
         </w:r>
         <w:r>
           <w:rPr>
@@ -1457,7 +1641,7 @@
           <w:rPr>
             <w:webHidden/>
           </w:rPr>
-          <w:t>4</w:t>
+          <w:t>5</w:t>
         </w:r>
         <w:r>
           <w:rPr>
@@ -1480,7 +1664,7 @@
           <w14:ligatures w14:val="standardContextual"/>
         </w:rPr>
       </w:pPr>
-      <w:hyperlink w:anchor="_Toc243744371" w:history="1">
+      <w:hyperlink w:anchor="_Toc243745020" w:history="1">
         <w:r>
           <w:rPr>
             <w:rStyle w:val="Hyperlink"/>
@@ -1507,7 +1691,7 @@
             <w:noProof/>
             <w:webHidden/>
           </w:rPr>
-          <w:instrText xml:space="preserve"> PAGEREF _Toc243744371 \h </w:instrText>
+          <w:instrText xml:space="preserve"> PAGEREF _Toc243745020 \h </w:instrText>
         </w:r>
         <w:r>
           <w:rPr>
@@ -1527,7 +1711,7 @@
             <w:noProof/>
             <w:webHidden/>
           </w:rPr>
-          <w:t>4</w:t>
+          <w:t>5</w:t>
         </w:r>
         <w:r>
           <w:rPr>
@@ -1551,7 +1735,7 @@
           <w14:ligatures w14:val="standardContextual"/>
         </w:rPr>
       </w:pPr>
-      <w:hyperlink w:anchor="_Toc243744372" w:history="1">
+      <w:hyperlink w:anchor="_Toc243745021" w:history="1">
         <w:r>
           <w:rPr>
             <w:rStyle w:val="Hyperlink"/>
@@ -1578,7 +1762,7 @@
             <w:noProof/>
             <w:webHidden/>
           </w:rPr>
-          <w:instrText xml:space="preserve"> PAGEREF _Toc243744372 \h </w:instrText>
+          <w:instrText xml:space="preserve"> PAGEREF _Toc243745021 \h </w:instrText>
         </w:r>
         <w:r>
           <w:rPr>
@@ -1598,7 +1782,7 @@
             <w:noProof/>
             <w:webHidden/>
           </w:rPr>
-          <w:t>4</w:t>
+          <w:t>5</w:t>
         </w:r>
         <w:r>
           <w:rPr>
@@ -1622,7 +1806,7 @@
           <w14:ligatures w14:val="standardContextual"/>
         </w:rPr>
       </w:pPr>
-      <w:hyperlink w:anchor="_Toc243744373" w:history="1">
+      <w:hyperlink w:anchor="_Toc243745022" w:history="1">
         <w:r>
           <w:rPr>
             <w:rStyle w:val="Hyperlink"/>
@@ -1649,7 +1833,7 @@
             <w:noProof/>
             <w:webHidden/>
           </w:rPr>
-          <w:instrText xml:space="preserve"> PAGEREF _Toc243744373 \h </w:instrText>
+          <w:instrText xml:space="preserve"> PAGEREF _Toc243745022 \h </w:instrText>
         </w:r>
         <w:r>
           <w:rPr>
@@ -1669,7 +1853,7 @@
             <w:noProof/>
             <w:webHidden/>
           </w:rPr>
-          <w:t>5</w:t>
+          <w:t>6</w:t>
         </w:r>
         <w:r>
           <w:rPr>
@@ -1693,7 +1877,7 @@
           <w14:ligatures w14:val="standardContextual"/>
         </w:rPr>
       </w:pPr>
-      <w:hyperlink w:anchor="_Toc243744374" w:history="1">
+      <w:hyperlink w:anchor="_Toc243745023" w:history="1">
         <w:r>
           <w:rPr>
             <w:rStyle w:val="Hyperlink"/>
@@ -1720,7 +1904,7 @@
             <w:noProof/>
             <w:webHidden/>
           </w:rPr>
-          <w:instrText xml:space="preserve"> PAGEREF _Toc243744374 \h </w:instrText>
+          <w:instrText xml:space="preserve"> PAGEREF _Toc243745023 \h </w:instrText>
         </w:r>
         <w:r>
           <w:rPr>
@@ -1740,7 +1924,7 @@
             <w:noProof/>
             <w:webHidden/>
           </w:rPr>
-          <w:t>5</w:t>
+          <w:t>6</w:t>
         </w:r>
         <w:r>
           <w:rPr>
@@ -1764,7 +1948,7 @@
           <w14:ligatures w14:val="standardContextual"/>
         </w:rPr>
       </w:pPr>
-      <w:hyperlink w:anchor="_Toc243744375" w:history="1">
+      <w:hyperlink w:anchor="_Toc243745024" w:history="1">
         <w:r>
           <w:rPr>
             <w:rStyle w:val="Hyperlink"/>
@@ -1791,7 +1975,7 @@
             <w:noProof/>
             <w:webHidden/>
           </w:rPr>
-          <w:instrText xml:space="preserve"> PAGEREF _Toc243744375 \h </w:instrText>
+          <w:instrText xml:space="preserve"> PAGEREF _Toc243745024 \h </w:instrText>
         </w:r>
         <w:r>
           <w:rPr>
@@ -1811,7 +1995,7 @@
             <w:noProof/>
             <w:webHidden/>
           </w:rPr>
-          <w:t>6</w:t>
+          <w:t>7</w:t>
         </w:r>
         <w:r>
           <w:rPr>
@@ -1835,7 +2019,7 @@
           <w14:ligatures w14:val="standardContextual"/>
         </w:rPr>
       </w:pPr>
-      <w:hyperlink w:anchor="_Toc243744376" w:history="1">
+      <w:hyperlink w:anchor="_Toc243745025" w:history="1">
         <w:r>
           <w:rPr>
             <w:rStyle w:val="Hyperlink"/>
@@ -1862,7 +2046,7 @@
             <w:noProof/>
             <w:webHidden/>
           </w:rPr>
-          <w:instrText xml:space="preserve"> PAGEREF _Toc243744376 \h </w:instrText>
+          <w:instrText xml:space="preserve"> PAGEREF _Toc243745025 \h </w:instrText>
         </w:r>
         <w:r>
           <w:rPr>
@@ -1882,7 +2066,7 @@
             <w:noProof/>
             <w:webHidden/>
           </w:rPr>
-          <w:t>7</w:t>
+          <w:t>8</w:t>
         </w:r>
         <w:r>
           <w:rPr>
@@ -1905,7 +2089,7 @@
           <w14:ligatures w14:val="standardContextual"/>
         </w:rPr>
       </w:pPr>
-      <w:hyperlink w:anchor="_Toc243744377" w:history="1">
+      <w:hyperlink w:anchor="_Toc243745026" w:history="1">
         <w:r>
           <w:rPr>
             <w:rStyle w:val="Hyperlink"/>
@@ -1928,7 +2112,7 @@
           <w:rPr>
             <w:webHidden/>
           </w:rPr>
-          <w:instrText xml:space="preserve"> PAGEREF _Toc243744377 \h </w:instrText>
+          <w:instrText xml:space="preserve"> PAGEREF _Toc243745026 \h </w:instrText>
         </w:r>
         <w:r>
           <w:rPr>
@@ -1945,7 +2129,7 @@
           <w:rPr>
             <w:webHidden/>
           </w:rPr>
-          <w:t>8</w:t>
+          <w:t>9</w:t>
         </w:r>
         <w:r>
           <w:rPr>
@@ -1968,7 +2152,7 @@
           <w14:ligatures w14:val="standardContextual"/>
         </w:rPr>
       </w:pPr>
-      <w:hyperlink w:anchor="_Toc243744378" w:history="1">
+      <w:hyperlink w:anchor="_Toc243745027" w:history="1">
         <w:r>
           <w:rPr>
             <w:rStyle w:val="Hyperlink"/>
@@ -1995,7 +2179,7 @@
             <w:noProof/>
             <w:webHidden/>
           </w:rPr>
-          <w:instrText xml:space="preserve"> PAGEREF _Toc243744378 \h </w:instrText>
+          <w:instrText xml:space="preserve"> PAGEREF _Toc243745027 \h </w:instrText>
         </w:r>
         <w:r>
           <w:rPr>
@@ -2015,7 +2199,7 @@
             <w:noProof/>
             <w:webHidden/>
           </w:rPr>
-          <w:t>8</w:t>
+          <w:t>9</w:t>
         </w:r>
         <w:r>
           <w:rPr>
@@ -2039,7 +2223,7 @@
           <w14:ligatures w14:val="standardContextual"/>
         </w:rPr>
       </w:pPr>
-      <w:hyperlink w:anchor="_Toc243744379" w:history="1">
+      <w:hyperlink w:anchor="_Toc243745028" w:history="1">
         <w:r>
           <w:rPr>
             <w:rStyle w:val="Hyperlink"/>
@@ -2066,7 +2250,7 @@
             <w:noProof/>
             <w:webHidden/>
           </w:rPr>
-          <w:instrText xml:space="preserve"> PAGEREF _Toc243744379 \h </w:instrText>
+          <w:instrText xml:space="preserve"> PAGEREF _Toc243745028 \h </w:instrText>
         </w:r>
         <w:r>
           <w:rPr>
@@ -2086,7 +2270,7 @@
             <w:noProof/>
             <w:webHidden/>
           </w:rPr>
-          <w:t>9</w:t>
+          <w:t>10</w:t>
         </w:r>
         <w:r>
           <w:rPr>
@@ -2110,7 +2294,7 @@
           <w14:ligatures w14:val="standardContextual"/>
         </w:rPr>
       </w:pPr>
-      <w:hyperlink w:anchor="_Toc243744380" w:history="1">
+      <w:hyperlink w:anchor="_Toc243745029" w:history="1">
         <w:r>
           <w:rPr>
             <w:rStyle w:val="Hyperlink"/>
@@ -2137,7 +2321,7 @@
             <w:noProof/>
             <w:webHidden/>
           </w:rPr>
-          <w:instrText xml:space="preserve"> PAGEREF _Toc243744380 \h </w:instrText>
+          <w:instrText xml:space="preserve"> PAGEREF _Toc243745029 \h </w:instrText>
         </w:r>
         <w:r>
           <w:rPr>
@@ -2157,7 +2341,7 @@
             <w:noProof/>
             <w:webHidden/>
           </w:rPr>
-          <w:t>10</w:t>
+          <w:t>11</w:t>
         </w:r>
         <w:r>
           <w:rPr>
@@ -2181,7 +2365,7 @@
           <w14:ligatures w14:val="standardContextual"/>
         </w:rPr>
       </w:pPr>
-      <w:hyperlink w:anchor="_Toc243744381" w:history="1">
+      <w:hyperlink w:anchor="_Toc243745030" w:history="1">
         <w:r>
           <w:rPr>
             <w:rStyle w:val="Hyperlink"/>
@@ -2208,7 +2392,7 @@
             <w:noProof/>
             <w:webHidden/>
           </w:rPr>
-          <w:instrText xml:space="preserve"> PAGEREF _Toc243744381 \h </w:instrText>
+          <w:instrText xml:space="preserve"> PAGEREF _Toc243745030 \h </w:instrText>
         </w:r>
         <w:r>
           <w:rPr>
@@ -2228,7 +2412,7 @@
             <w:noProof/>
             <w:webHidden/>
           </w:rPr>
-          <w:t>11</w:t>
+          <w:t>12</w:t>
         </w:r>
         <w:r>
           <w:rPr>
@@ -2252,7 +2436,7 @@
           <w14:ligatures w14:val="standardContextual"/>
         </w:rPr>
       </w:pPr>
-      <w:hyperlink w:anchor="_Toc243744382" w:history="1">
+      <w:hyperlink w:anchor="_Toc243745031" w:history="1">
         <w:r>
           <w:rPr>
             <w:rStyle w:val="Hyperlink"/>
@@ -2279,7 +2463,7 @@
             <w:noProof/>
             <w:webHidden/>
           </w:rPr>
-          <w:instrText xml:space="preserve"> PAGEREF _Toc243744382 \h </w:instrText>
+          <w:instrText xml:space="preserve"> PAGEREF _Toc243745031 \h </w:instrText>
         </w:r>
         <w:r>
           <w:rPr>
@@ -2299,7 +2483,7 @@
             <w:noProof/>
             <w:webHidden/>
           </w:rPr>
-          <w:t>12</w:t>
+          <w:t>13</w:t>
         </w:r>
         <w:r>
           <w:rPr>
@@ -2323,7 +2507,7 @@
           <w14:ligatures w14:val="standardContextual"/>
         </w:rPr>
       </w:pPr>
-      <w:hyperlink w:anchor="_Toc243744383" w:history="1">
+      <w:hyperlink w:anchor="_Toc243745032" w:history="1">
         <w:r>
           <w:rPr>
             <w:rStyle w:val="Hyperlink"/>
@@ -2350,7 +2534,7 @@
             <w:noProof/>
             <w:webHidden/>
           </w:rPr>
-          <w:instrText xml:space="preserve"> PAGEREF _Toc243744383 \h </w:instrText>
+          <w:instrText xml:space="preserve"> PAGEREF _Toc243745032 \h </w:instrText>
         </w:r>
         <w:r>
           <w:rPr>
@@ -2370,7 +2554,7 @@
             <w:noProof/>
             <w:webHidden/>
           </w:rPr>
-          <w:t>13</w:t>
+          <w:t>14</w:t>
         </w:r>
         <w:r>
           <w:rPr>
@@ -2394,7 +2578,7 @@
           <w14:ligatures w14:val="standardContextual"/>
         </w:rPr>
       </w:pPr>
-      <w:hyperlink w:anchor="_Toc243744384" w:history="1">
+      <w:hyperlink w:anchor="_Toc243745033" w:history="1">
         <w:r>
           <w:rPr>
             <w:rStyle w:val="Hyperlink"/>
@@ -2421,7 +2605,7 @@
             <w:noProof/>
             <w:webHidden/>
           </w:rPr>
-          <w:instrText xml:space="preserve"> PAGEREF _Toc243744384 \h </w:instrText>
+          <w:instrText xml:space="preserve"> PAGEREF _Toc243745033 \h </w:instrText>
         </w:r>
         <w:r>
           <w:rPr>
@@ -2441,7 +2625,7 @@
             <w:noProof/>
             <w:webHidden/>
           </w:rPr>
-          <w:t>14</w:t>
+          <w:t>15</w:t>
         </w:r>
         <w:r>
           <w:rPr>
@@ -2465,7 +2649,7 @@
           <w14:ligatures w14:val="standardContextual"/>
         </w:rPr>
       </w:pPr>
-      <w:hyperlink w:anchor="_Toc243744385" w:history="1">
+      <w:hyperlink w:anchor="_Toc243745034" w:history="1">
         <w:r>
           <w:rPr>
             <w:rStyle w:val="Hyperlink"/>
@@ -2492,7 +2676,7 @@
             <w:noProof/>
             <w:webHidden/>
           </w:rPr>
-          <w:instrText xml:space="preserve"> PAGEREF _Toc243744385 \h </w:instrText>
+          <w:instrText xml:space="preserve"> PAGEREF _Toc243745034 \h </w:instrText>
         </w:r>
         <w:r>
           <w:rPr>
@@ -2512,7 +2696,7 @@
             <w:noProof/>
             <w:webHidden/>
           </w:rPr>
-          <w:t>14</w:t>
+          <w:t>15</w:t>
         </w:r>
         <w:r>
           <w:rPr>
@@ -2536,7 +2720,7 @@
           <w14:ligatures w14:val="standardContextual"/>
         </w:rPr>
       </w:pPr>
-      <w:hyperlink w:anchor="_Toc243744386" w:history="1">
+      <w:hyperlink w:anchor="_Toc243745035" w:history="1">
         <w:r>
           <w:rPr>
             <w:rStyle w:val="Hyperlink"/>
@@ -2563,7 +2747,7 @@
             <w:noProof/>
             <w:webHidden/>
           </w:rPr>
-          <w:instrText xml:space="preserve"> PAGEREF _Toc243744386 \h </w:instrText>
+          <w:instrText xml:space="preserve"> PAGEREF _Toc243745035 \h </w:instrText>
         </w:r>
         <w:r>
           <w:rPr>
@@ -2583,7 +2767,7 @@
             <w:noProof/>
             <w:webHidden/>
           </w:rPr>
-          <w:t>15</w:t>
+          <w:t>16</w:t>
         </w:r>
         <w:r>
           <w:rPr>
@@ -2607,7 +2791,7 @@
           <w14:ligatures w14:val="standardContextual"/>
         </w:rPr>
       </w:pPr>
-      <w:hyperlink w:anchor="_Toc243744387" w:history="1">
+      <w:hyperlink w:anchor="_Toc243745036" w:history="1">
         <w:r>
           <w:rPr>
             <w:rStyle w:val="Hyperlink"/>
@@ -2634,7 +2818,7 @@
             <w:noProof/>
             <w:webHidden/>
           </w:rPr>
-          <w:instrText xml:space="preserve"> PAGEREF _Toc243744387 \h </w:instrText>
+          <w:instrText xml:space="preserve"> PAGEREF _Toc243745036 \h </w:instrText>
         </w:r>
         <w:r>
           <w:rPr>
@@ -2654,7 +2838,7 @@
             <w:noProof/>
             <w:webHidden/>
           </w:rPr>
-          <w:t>15</w:t>
+          <w:t>16</w:t>
         </w:r>
         <w:r>
           <w:rPr>
@@ -2678,7 +2862,7 @@
           <w14:ligatures w14:val="standardContextual"/>
         </w:rPr>
       </w:pPr>
-      <w:hyperlink w:anchor="_Toc243744388" w:history="1">
+      <w:hyperlink w:anchor="_Toc243745037" w:history="1">
         <w:r>
           <w:rPr>
             <w:rStyle w:val="Hyperlink"/>
@@ -2705,7 +2889,7 @@
             <w:noProof/>
             <w:webHidden/>
           </w:rPr>
-          <w:instrText xml:space="preserve"> PAGEREF _Toc243744388 \h </w:instrText>
+          <w:instrText xml:space="preserve"> PAGEREF _Toc243745037 \h </w:instrText>
         </w:r>
         <w:r>
           <w:rPr>
@@ -2725,7 +2909,7 @@
             <w:noProof/>
             <w:webHidden/>
           </w:rPr>
-          <w:t>16</w:t>
+          <w:t>17</w:t>
         </w:r>
         <w:r>
           <w:rPr>
@@ -2749,7 +2933,7 @@
           <w14:ligatures w14:val="standardContextual"/>
         </w:rPr>
       </w:pPr>
-      <w:hyperlink w:anchor="_Toc243744389" w:history="1">
+      <w:hyperlink w:anchor="_Toc243745038" w:history="1">
         <w:r>
           <w:rPr>
             <w:rStyle w:val="Hyperlink"/>
@@ -2776,7 +2960,7 @@
             <w:noProof/>
             <w:webHidden/>
           </w:rPr>
-          <w:instrText xml:space="preserve"> PAGEREF _Toc243744389 \h </w:instrText>
+          <w:instrText xml:space="preserve"> PAGEREF _Toc243745038 \h </w:instrText>
         </w:r>
         <w:r>
           <w:rPr>
@@ -2796,7 +2980,7 @@
             <w:noProof/>
             <w:webHidden/>
           </w:rPr>
-          <w:t>17</w:t>
+          <w:t>18</w:t>
         </w:r>
         <w:r>
           <w:rPr>
@@ -2820,7 +3004,7 @@
           <w14:ligatures w14:val="standardContextual"/>
         </w:rPr>
       </w:pPr>
-      <w:hyperlink w:anchor="_Toc243744390" w:history="1">
+      <w:hyperlink w:anchor="_Toc243745039" w:history="1">
         <w:r>
           <w:rPr>
             <w:rStyle w:val="Hyperlink"/>
@@ -2847,7 +3031,7 @@
             <w:noProof/>
             <w:webHidden/>
           </w:rPr>
-          <w:instrText xml:space="preserve"> PAGEREF _Toc243744390 \h </w:instrText>
+          <w:instrText xml:space="preserve"> PAGEREF _Toc243745039 \h </w:instrText>
         </w:r>
         <w:r>
           <w:rPr>
@@ -2867,7 +3051,7 @@
             <w:noProof/>
             <w:webHidden/>
           </w:rPr>
-          <w:t>18</w:t>
+          <w:t>19</w:t>
         </w:r>
         <w:r>
           <w:rPr>
@@ -2891,7 +3075,7 @@
           <w14:ligatures w14:val="standardContextual"/>
         </w:rPr>
       </w:pPr>
-      <w:hyperlink w:anchor="_Toc243744391" w:history="1">
+      <w:hyperlink w:anchor="_Toc243745040" w:history="1">
         <w:r>
           <w:rPr>
             <w:rStyle w:val="Hyperlink"/>
@@ -2918,7 +3102,7 @@
             <w:noProof/>
             <w:webHidden/>
           </w:rPr>
-          <w:instrText xml:space="preserve"> PAGEREF _Toc243744391 \h </w:instrText>
+          <w:instrText xml:space="preserve"> PAGEREF _Toc243745040 \h </w:instrText>
         </w:r>
         <w:r>
           <w:rPr>
@@ -2938,7 +3122,7 @@
             <w:noProof/>
             <w:webHidden/>
           </w:rPr>
-          <w:t>19</w:t>
+          <w:t>20</w:t>
         </w:r>
         <w:r>
           <w:rPr>
@@ -2962,7 +3146,7 @@
           <w14:ligatures w14:val="standardContextual"/>
         </w:rPr>
       </w:pPr>
-      <w:hyperlink w:anchor="_Toc243744392" w:history="1">
+      <w:hyperlink w:anchor="_Toc243745041" w:history="1">
         <w:r>
           <w:rPr>
             <w:rStyle w:val="Hyperlink"/>
@@ -2989,7 +3173,7 @@
             <w:noProof/>
             <w:webHidden/>
           </w:rPr>
-          <w:instrText xml:space="preserve"> PAGEREF _Toc243744392 \h </w:instrText>
+          <w:instrText xml:space="preserve"> PAGEREF _Toc243745041 \h </w:instrText>
         </w:r>
         <w:r>
           <w:rPr>
@@ -3009,7 +3193,7 @@
             <w:noProof/>
             <w:webHidden/>
           </w:rPr>
-          <w:t>21</w:t>
+          <w:t>22</w:t>
         </w:r>
         <w:r>
           <w:rPr>
@@ -3033,7 +3217,7 @@
           <w14:ligatures w14:val="standardContextual"/>
         </w:rPr>
       </w:pPr>
-      <w:hyperlink w:anchor="_Toc243744393" w:history="1">
+      <w:hyperlink w:anchor="_Toc243745042" w:history="1">
         <w:r>
           <w:rPr>
             <w:rStyle w:val="Hyperlink"/>
@@ -3060,7 +3244,7 @@
             <w:noProof/>
             <w:webHidden/>
           </w:rPr>
-          <w:instrText xml:space="preserve"> PAGEREF _Toc243744393 \h </w:instrText>
+          <w:instrText xml:space="preserve"> PAGEREF _Toc243745042 \h </w:instrText>
         </w:r>
         <w:r>
           <w:rPr>
@@ -3080,7 +3264,7 @@
             <w:noProof/>
             <w:webHidden/>
           </w:rPr>
-          <w:t>22</w:t>
+          <w:t>23</w:t>
         </w:r>
         <w:r>
           <w:rPr>
@@ -3104,7 +3288,7 @@
           <w14:ligatures w14:val="standardContextual"/>
         </w:rPr>
       </w:pPr>
-      <w:hyperlink w:anchor="_Toc243744394" w:history="1">
+      <w:hyperlink w:anchor="_Toc243745043" w:history="1">
         <w:r>
           <w:rPr>
             <w:rStyle w:val="Hyperlink"/>
@@ -3131,7 +3315,7 @@
             <w:noProof/>
             <w:webHidden/>
           </w:rPr>
-          <w:instrText xml:space="preserve"> PAGEREF _Toc243744394 \h </w:instrText>
+          <w:instrText xml:space="preserve"> PAGEREF _Toc243745043 \h </w:instrText>
         </w:r>
         <w:r>
           <w:rPr>
@@ -3151,7 +3335,7 @@
             <w:noProof/>
             <w:webHidden/>
           </w:rPr>
-          <w:t>23</w:t>
+          <w:t>24</w:t>
         </w:r>
         <w:r>
           <w:rPr>
@@ -3174,7 +3358,7 @@
           <w14:ligatures w14:val="standardContextual"/>
         </w:rPr>
       </w:pPr>
-      <w:hyperlink w:anchor="_Toc243744395" w:history="1">
+      <w:hyperlink w:anchor="_Toc243745044" w:history="1">
         <w:r>
           <w:rPr>
             <w:rStyle w:val="Hyperlink"/>
@@ -3197,7 +3381,7 @@
           <w:rPr>
             <w:webHidden/>
           </w:rPr>
-          <w:instrText xml:space="preserve"> PAGEREF _Toc243744395 \h </w:instrText>
+          <w:instrText xml:space="preserve"> PAGEREF _Toc243745044 \h </w:instrText>
         </w:r>
         <w:r>
           <w:rPr>
@@ -3214,7 +3398,7 @@
           <w:rPr>
             <w:webHidden/>
           </w:rPr>
-          <w:t>24</w:t>
+          <w:t>25</w:t>
         </w:r>
         <w:r>
           <w:rPr>
@@ -3237,7 +3421,7 @@
           <w14:ligatures w14:val="standardContextual"/>
         </w:rPr>
       </w:pPr>
-      <w:hyperlink w:anchor="_Toc243744396" w:history="1">
+      <w:hyperlink w:anchor="_Toc243745045" w:history="1">
         <w:r>
           <w:rPr>
             <w:rStyle w:val="Hyperlink"/>
@@ -3264,7 +3448,7 @@
             <w:noProof/>
             <w:webHidden/>
           </w:rPr>
-          <w:instrText xml:space="preserve"> PAGEREF _Toc243744396 \h </w:instrText>
+          <w:instrText xml:space="preserve"> PAGEREF _Toc243745045 \h </w:instrText>
         </w:r>
         <w:r>
           <w:rPr>
@@ -3284,7 +3468,7 @@
             <w:noProof/>
             <w:webHidden/>
           </w:rPr>
-          <w:t>24</w:t>
+          <w:t>25</w:t>
         </w:r>
         <w:r>
           <w:rPr>
@@ -3308,7 +3492,7 @@
           <w14:ligatures w14:val="standardContextual"/>
         </w:rPr>
       </w:pPr>
-      <w:hyperlink w:anchor="_Toc243744397" w:history="1">
+      <w:hyperlink w:anchor="_Toc243745046" w:history="1">
         <w:r>
           <w:rPr>
             <w:rStyle w:val="Hyperlink"/>
@@ -3335,7 +3519,7 @@
             <w:noProof/>
             <w:webHidden/>
           </w:rPr>
-          <w:instrText xml:space="preserve"> PAGEREF _Toc243744397 \h </w:instrText>
+          <w:instrText xml:space="preserve"> PAGEREF _Toc243745046 \h </w:instrText>
         </w:r>
         <w:r>
           <w:rPr>
@@ -3355,7 +3539,7 @@
             <w:noProof/>
             <w:webHidden/>
           </w:rPr>
-          <w:t>24</w:t>
+          <w:t>25</w:t>
         </w:r>
         <w:r>
           <w:rPr>
@@ -3379,7 +3563,7 @@
           <w14:ligatures w14:val="standardContextual"/>
         </w:rPr>
       </w:pPr>
-      <w:hyperlink w:anchor="_Toc243744398" w:history="1">
+      <w:hyperlink w:anchor="_Toc243745047" w:history="1">
         <w:r>
           <w:rPr>
             <w:rStyle w:val="Hyperlink"/>
@@ -3406,7 +3590,7 @@
             <w:noProof/>
             <w:webHidden/>
           </w:rPr>
-          <w:instrText xml:space="preserve"> PAGEREF _Toc243744398 \h </w:instrText>
+          <w:instrText xml:space="preserve"> PAGEREF _Toc243745047 \h </w:instrText>
         </w:r>
         <w:r>
           <w:rPr>
@@ -3426,7 +3610,7 @@
             <w:noProof/>
             <w:webHidden/>
           </w:rPr>
-          <w:t>25</w:t>
+          <w:t>26</w:t>
         </w:r>
         <w:r>
           <w:rPr>
@@ -3450,7 +3634,7 @@
           <w14:ligatures w14:val="standardContextual"/>
         </w:rPr>
       </w:pPr>
-      <w:hyperlink w:anchor="_Toc243744399" w:history="1">
+      <w:hyperlink w:anchor="_Toc243745048" w:history="1">
         <w:r>
           <w:rPr>
             <w:rStyle w:val="Hyperlink"/>
@@ -3477,7 +3661,7 @@
             <w:noProof/>
             <w:webHidden/>
           </w:rPr>
-          <w:instrText xml:space="preserve"> PAGEREF _Toc243744399 \h </w:instrText>
+          <w:instrText xml:space="preserve"> PAGEREF _Toc243745048 \h </w:instrText>
         </w:r>
         <w:r>
           <w:rPr>
@@ -3497,7 +3681,7 @@
             <w:noProof/>
             <w:webHidden/>
           </w:rPr>
-          <w:t>26</w:t>
+          <w:t>27</w:t>
         </w:r>
         <w:r>
           <w:rPr>
@@ -3521,7 +3705,7 @@
           <w14:ligatures w14:val="standardContextual"/>
         </w:rPr>
       </w:pPr>
-      <w:hyperlink w:anchor="_Toc243744400" w:history="1">
+      <w:hyperlink w:anchor="_Toc243745049" w:history="1">
         <w:r>
           <w:rPr>
             <w:rStyle w:val="Hyperlink"/>
@@ -3548,7 +3732,7 @@
             <w:noProof/>
             <w:webHidden/>
           </w:rPr>
-          <w:instrText xml:space="preserve"> PAGEREF _Toc243744400 \h </w:instrText>
+          <w:instrText xml:space="preserve"> PAGEREF _Toc243745049 \h </w:instrText>
         </w:r>
         <w:r>
           <w:rPr>
@@ -3568,7 +3752,7 @@
             <w:noProof/>
             <w:webHidden/>
           </w:rPr>
-          <w:t>28</w:t>
+          <w:t>29</w:t>
         </w:r>
         <w:r>
           <w:rPr>
@@ -3592,7 +3776,7 @@
           <w14:ligatures w14:val="standardContextual"/>
         </w:rPr>
       </w:pPr>
-      <w:hyperlink w:anchor="_Toc243744401" w:history="1">
+      <w:hyperlink w:anchor="_Toc243745050" w:history="1">
         <w:r>
           <w:rPr>
             <w:rStyle w:val="Hyperlink"/>
@@ -3619,7 +3803,7 @@
             <w:noProof/>
             <w:webHidden/>
           </w:rPr>
-          <w:instrText xml:space="preserve"> PAGEREF _Toc243744401 \h </w:instrText>
+          <w:instrText xml:space="preserve"> PAGEREF _Toc243745050 \h </w:instrText>
         </w:r>
         <w:r>
           <w:rPr>
@@ -3639,7 +3823,7 @@
             <w:noProof/>
             <w:webHidden/>
           </w:rPr>
-          <w:t>29</w:t>
+          <w:t>30</w:t>
         </w:r>
         <w:r>
           <w:rPr>
@@ -3662,7 +3846,7 @@
           <w14:ligatures w14:val="standardContextual"/>
         </w:rPr>
       </w:pPr>
-      <w:hyperlink w:anchor="_Toc243744402" w:history="1">
+      <w:hyperlink w:anchor="_Toc243745051" w:history="1">
         <w:r>
           <w:rPr>
             <w:rStyle w:val="Hyperlink"/>
@@ -3685,7 +3869,7 @@
           <w:rPr>
             <w:webHidden/>
           </w:rPr>
-          <w:instrText xml:space="preserve"> PAGEREF _Toc243744402 \h </w:instrText>
+          <w:instrText xml:space="preserve"> PAGEREF _Toc243745051 \h </w:instrText>
         </w:r>
         <w:r>
           <w:rPr>
@@ -3702,7 +3886,7 @@
           <w:rPr>
             <w:webHidden/>
           </w:rPr>
-          <w:t>30</w:t>
+          <w:t>31</w:t>
         </w:r>
         <w:r>
           <w:rPr>
@@ -3725,7 +3909,7 @@
           <w14:ligatures w14:val="standardContextual"/>
         </w:rPr>
       </w:pPr>
-      <w:hyperlink w:anchor="_Toc243744403" w:history="1">
+      <w:hyperlink w:anchor="_Toc243745052" w:history="1">
         <w:r>
           <w:rPr>
             <w:rStyle w:val="Hyperlink"/>
@@ -3752,7 +3936,7 @@
             <w:noProof/>
             <w:webHidden/>
           </w:rPr>
-          <w:instrText xml:space="preserve"> PAGEREF _Toc243744403 \h </w:instrText>
+          <w:instrText xml:space="preserve"> PAGEREF _Toc243745052 \h </w:instrText>
         </w:r>
         <w:r>
           <w:rPr>
@@ -3772,7 +3956,7 @@
             <w:noProof/>
             <w:webHidden/>
           </w:rPr>
-          <w:t>30</w:t>
+          <w:t>31</w:t>
         </w:r>
         <w:r>
           <w:rPr>
@@ -3796,7 +3980,7 @@
           <w14:ligatures w14:val="standardContextual"/>
         </w:rPr>
       </w:pPr>
-      <w:hyperlink w:anchor="_Toc243744404" w:history="1">
+      <w:hyperlink w:anchor="_Toc243745053" w:history="1">
         <w:r>
           <w:rPr>
             <w:rStyle w:val="Hyperlink"/>
@@ -3823,7 +4007,7 @@
             <w:noProof/>
             <w:webHidden/>
           </w:rPr>
-          <w:instrText xml:space="preserve"> PAGEREF _Toc243744404 \h </w:instrText>
+          <w:instrText xml:space="preserve"> PAGEREF _Toc243745053 \h </w:instrText>
         </w:r>
         <w:r>
           <w:rPr>
@@ -3843,7 +4027,7 @@
             <w:noProof/>
             <w:webHidden/>
           </w:rPr>
-          <w:t>30</w:t>
+          <w:t>31</w:t>
         </w:r>
         <w:r>
           <w:rPr>
@@ -3867,7 +4051,7 @@
           <w14:ligatures w14:val="standardContextual"/>
         </w:rPr>
       </w:pPr>
-      <w:hyperlink w:anchor="_Toc243744405" w:history="1">
+      <w:hyperlink w:anchor="_Toc243745054" w:history="1">
         <w:r>
           <w:rPr>
             <w:rStyle w:val="Hyperlink"/>
@@ -3894,7 +4078,7 @@
             <w:noProof/>
             <w:webHidden/>
           </w:rPr>
-          <w:instrText xml:space="preserve"> PAGEREF _Toc243744405 \h </w:instrText>
+          <w:instrText xml:space="preserve"> PAGEREF _Toc243745054 \h </w:instrText>
         </w:r>
         <w:r>
           <w:rPr>
@@ -3914,7 +4098,7 @@
             <w:noProof/>
             <w:webHidden/>
           </w:rPr>
-          <w:t>31</w:t>
+          <w:t>32</w:t>
         </w:r>
         <w:r>
           <w:rPr>
@@ -3938,7 +4122,7 @@
           <w14:ligatures w14:val="standardContextual"/>
         </w:rPr>
       </w:pPr>
-      <w:hyperlink w:anchor="_Toc243744406" w:history="1">
+      <w:hyperlink w:anchor="_Toc243745055" w:history="1">
         <w:r>
           <w:rPr>
             <w:rStyle w:val="Hyperlink"/>
@@ -3965,7 +4149,7 @@
             <w:noProof/>
             <w:webHidden/>
           </w:rPr>
-          <w:instrText xml:space="preserve"> PAGEREF _Toc243744406 \h </w:instrText>
+          <w:instrText xml:space="preserve"> PAGEREF _Toc243745055 \h </w:instrText>
         </w:r>
         <w:r>
           <w:rPr>
@@ -3985,7 +4169,7 @@
             <w:noProof/>
             <w:webHidden/>
           </w:rPr>
-          <w:t>31</w:t>
+          <w:t>32</w:t>
         </w:r>
         <w:r>
           <w:rPr>
@@ -4009,7 +4193,7 @@
           <w14:ligatures w14:val="standardContextual"/>
         </w:rPr>
       </w:pPr>
-      <w:hyperlink w:anchor="_Toc243744407" w:history="1">
+      <w:hyperlink w:anchor="_Toc243745056" w:history="1">
         <w:r>
           <w:rPr>
             <w:rStyle w:val="Hyperlink"/>
@@ -4036,7 +4220,7 @@
             <w:noProof/>
             <w:webHidden/>
           </w:rPr>
-          <w:instrText xml:space="preserve"> PAGEREF _Toc243744407 \h </w:instrText>
+          <w:instrText xml:space="preserve"> PAGEREF _Toc243745056 \h </w:instrText>
         </w:r>
         <w:r>
           <w:rPr>
@@ -4056,7 +4240,7 @@
             <w:noProof/>
             <w:webHidden/>
           </w:rPr>
-          <w:t>32</w:t>
+          <w:t>33</w:t>
         </w:r>
         <w:r>
           <w:rPr>
@@ -4080,7 +4264,7 @@
           <w14:ligatures w14:val="standardContextual"/>
         </w:rPr>
       </w:pPr>
-      <w:hyperlink w:anchor="_Toc243744408" w:history="1">
+      <w:hyperlink w:anchor="_Toc243745057" w:history="1">
         <w:r>
           <w:rPr>
             <w:rStyle w:val="Hyperlink"/>
@@ -4107,7 +4291,7 @@
             <w:noProof/>
             <w:webHidden/>
           </w:rPr>
-          <w:instrText xml:space="preserve"> PAGEREF _Toc243744408 \h </w:instrText>
+          <w:instrText xml:space="preserve"> PAGEREF _Toc243745057 \h </w:instrText>
         </w:r>
         <w:r>
           <w:rPr>
@@ -4127,7 +4311,7 @@
             <w:noProof/>
             <w:webHidden/>
           </w:rPr>
-          <w:t>32</w:t>
+          <w:t>33</w:t>
         </w:r>
         <w:r>
           <w:rPr>
@@ -4150,7 +4334,7 @@
           <w14:ligatures w14:val="standardContextual"/>
         </w:rPr>
       </w:pPr>
-      <w:hyperlink w:anchor="_Toc243744409" w:history="1">
+      <w:hyperlink w:anchor="_Toc243745058" w:history="1">
         <w:r>
           <w:rPr>
             <w:rStyle w:val="Hyperlink"/>
@@ -4173,7 +4357,7 @@
           <w:rPr>
             <w:webHidden/>
           </w:rPr>
-          <w:instrText xml:space="preserve"> PAGEREF _Toc243744409 \h </w:instrText>
+          <w:instrText xml:space="preserve"> PAGEREF _Toc243745058 \h </w:instrText>
         </w:r>
         <w:r>
           <w:rPr>
@@ -4190,7 +4374,7 @@
           <w:rPr>
             <w:webHidden/>
           </w:rPr>
-          <w:t>33</w:t>
+          <w:t>34</w:t>
         </w:r>
         <w:r>
           <w:rPr>
@@ -4212,7 +4396,7 @@
           <w14:ligatures w14:val="standardContextual"/>
         </w:rPr>
       </w:pPr>
-      <w:hyperlink w:anchor="_Toc243744410" w:history="1">
+      <w:hyperlink w:anchor="_Toc243745059" w:history="1">
         <w:r>
           <w:rPr>
             <w:rStyle w:val="Hyperlink"/>
@@ -4235,7 +4419,7 @@
           <w:rPr>
             <w:webHidden/>
           </w:rPr>
-          <w:instrText xml:space="preserve"> PAGEREF _Toc243744410 \h </w:instrText>
+          <w:instrText xml:space="preserve"> PAGEREF _Toc243745059 \h </w:instrText>
         </w:r>
         <w:r>
           <w:rPr>
@@ -4252,7 +4436,7 @@
           <w:rPr>
             <w:webHidden/>
           </w:rPr>
-          <w:t>35</w:t>
+          <w:t>36</w:t>
         </w:r>
         <w:r>
           <w:rPr>
@@ -4274,7 +4458,7 @@
           <w14:ligatures w14:val="standardContextual"/>
         </w:rPr>
       </w:pPr>
-      <w:hyperlink w:anchor="_Toc243744411" w:history="1">
+      <w:hyperlink w:anchor="_Toc243745060" w:history="1">
         <w:r>
           <w:rPr>
             <w:rStyle w:val="Hyperlink"/>
@@ -4297,7 +4481,7 @@
           <w:rPr>
             <w:webHidden/>
           </w:rPr>
-          <w:instrText xml:space="preserve"> PAGEREF _Toc243744411 \h </w:instrText>
+          <w:instrText xml:space="preserve"> PAGEREF _Toc243745060 \h </w:instrText>
         </w:r>
         <w:r>
           <w:rPr>
@@ -4314,7 +4498,7 @@
           <w:rPr>
             <w:webHidden/>
           </w:rPr>
-          <w:t>36</w:t>
+          <w:t>37</w:t>
         </w:r>
         <w:r>
           <w:rPr>
@@ -4336,7 +4520,7 @@
           <w14:ligatures w14:val="standardContextual"/>
         </w:rPr>
       </w:pPr>
-      <w:hyperlink w:anchor="_Toc243744412" w:history="1">
+      <w:hyperlink w:anchor="_Toc243745061" w:history="1">
         <w:r>
           <w:rPr>
             <w:rStyle w:val="Hyperlink"/>
@@ -4359,7 +4543,7 @@
           <w:rPr>
             <w:webHidden/>
           </w:rPr>
-          <w:instrText xml:space="preserve"> PAGEREF _Toc243744412 \h </w:instrText>
+          <w:instrText xml:space="preserve"> PAGEREF _Toc243745061 \h </w:instrText>
         </w:r>
         <w:r>
           <w:rPr>
@@ -4376,7 +4560,7 @@
           <w:rPr>
             <w:webHidden/>
           </w:rPr>
-          <w:t>37</w:t>
+          <w:t>38</w:t>
         </w:r>
         <w:r>
           <w:rPr>
@@ -4398,7 +4582,7 @@
           <w14:ligatures w14:val="standardContextual"/>
         </w:rPr>
       </w:pPr>
-      <w:hyperlink w:anchor="_Toc243744413" w:history="1">
+      <w:hyperlink w:anchor="_Toc243745062" w:history="1">
         <w:r>
           <w:rPr>
             <w:rStyle w:val="Hyperlink"/>
@@ -4421,7 +4605,7 @@
           <w:rPr>
             <w:webHidden/>
           </w:rPr>
-          <w:instrText xml:space="preserve"> PAGEREF _Toc243744413 \h </w:instrText>
+          <w:instrText xml:space="preserve"> PAGEREF _Toc243745062 \h </w:instrText>
         </w:r>
         <w:r>
           <w:rPr>
@@ -4438,7 +4622,7 @@
           <w:rPr>
             <w:webHidden/>
           </w:rPr>
-          <w:t>38</w:t>
+          <w:t>39</w:t>
         </w:r>
         <w:r>
           <w:rPr>
@@ -4462,11 +4646,11 @@
       <w:pPr>
         <w:pStyle w:val="Heading1"/>
       </w:pPr>
-      <w:bookmarkStart w:id="4" w:name="_Toc243744357"/>
+      <w:bookmarkStart w:id="6" w:name="_Toc243745006"/>
       <w:r>
         <w:t>List of Figures</w:t>
       </w:r>
-      <w:bookmarkEnd w:id="4"/>
+      <w:bookmarkEnd w:id="6"/>
     </w:p>
     <w:p>
       <w:pPr>
@@ -4489,7 +4673,7 @@
       <w:r>
         <w:fldChar w:fldCharType="separate"/>
       </w:r>
-      <w:hyperlink w:anchor="_Toc243744414" w:history="1">
+      <w:hyperlink w:anchor="_Toc243745063" w:history="1">
         <w:r>
           <w:rPr>
             <w:rStyle w:val="Hyperlink"/>
@@ -4512,7 +4696,7 @@
           <w:rPr>
             <w:webHidden/>
           </w:rPr>
-          <w:instrText xml:space="preserve"> PAGEREF _Toc243744414 \h </w:instrText>
+          <w:instrText xml:space="preserve"> PAGEREF _Toc243745063 \h </w:instrText>
         </w:r>
         <w:r>
           <w:rPr>
@@ -4529,7 +4713,7 @@
           <w:rPr>
             <w:webHidden/>
           </w:rPr>
-          <w:t>10</w:t>
+          <w:t>11</w:t>
         </w:r>
         <w:r>
           <w:rPr>
@@ -4551,7 +4735,7 @@
           <w14:ligatures w14:val="standardContextual"/>
         </w:rPr>
       </w:pPr>
-      <w:hyperlink w:anchor="_Toc243744415" w:history="1">
+      <w:hyperlink w:anchor="_Toc243745064" w:history="1">
         <w:r>
           <w:rPr>
             <w:rStyle w:val="Hyperlink"/>
@@ -4574,7 +4758,7 @@
           <w:rPr>
             <w:webHidden/>
           </w:rPr>
-          <w:instrText xml:space="preserve"> PAGEREF _Toc243744415 \h </w:instrText>
+          <w:instrText xml:space="preserve"> PAGEREF _Toc243745064 \h </w:instrText>
         </w:r>
         <w:r>
           <w:rPr>
@@ -4591,7 +4775,7 @@
           <w:rPr>
             <w:webHidden/>
           </w:rPr>
-          <w:t>12</w:t>
+          <w:t>13</w:t>
         </w:r>
         <w:r>
           <w:rPr>
@@ -4610,11 +4794,11 @@
       <w:pPr>
         <w:pStyle w:val="Heading1"/>
       </w:pPr>
-      <w:bookmarkStart w:id="5" w:name="_Toc243744358"/>
+      <w:bookmarkStart w:id="7" w:name="_Toc243745007"/>
       <w:r>
         <w:t>List of Tables</w:t>
       </w:r>
-      <w:bookmarkEnd w:id="5"/>
+      <w:bookmarkEnd w:id="7"/>
     </w:p>
     <w:p>
       <w:pPr>
@@ -4637,7 +4821,7 @@
       <w:r>
         <w:fldChar w:fldCharType="separate"/>
       </w:r>
-      <w:hyperlink w:anchor="_Toc243744416" w:history="1">
+      <w:hyperlink w:anchor="_Toc243745065" w:history="1">
         <w:r>
           <w:rPr>
             <w:rStyle w:val="Hyperlink"/>
@@ -4660,7 +4844,7 @@
           <w:rPr>
             <w:webHidden/>
           </w:rPr>
-          <w:instrText xml:space="preserve"> PAGEREF _Toc243744416 \h </w:instrText>
+          <w:instrText xml:space="preserve"> PAGEREF _Toc243745065 \h </w:instrText>
         </w:r>
         <w:r>
           <w:rPr>
@@ -4677,7 +4861,7 @@
           <w:rPr>
             <w:webHidden/>
           </w:rPr>
-          <w:t>viii</w:t>
+          <w:t>x</w:t>
         </w:r>
         <w:r>
           <w:rPr>
@@ -4699,7 +4883,7 @@
           <w14:ligatures w14:val="standardContextual"/>
         </w:rPr>
       </w:pPr>
-      <w:hyperlink w:anchor="_Toc243744417" w:history="1">
+      <w:hyperlink w:anchor="_Toc243745066" w:history="1">
         <w:r>
           <w:rPr>
             <w:rStyle w:val="Hyperlink"/>
@@ -4722,7 +4906,7 @@
           <w:rPr>
             <w:webHidden/>
           </w:rPr>
-          <w:instrText xml:space="preserve"> PAGEREF _Toc243744417 \h </w:instrText>
+          <w:instrText xml:space="preserve"> PAGEREF _Toc243745066 \h </w:instrText>
         </w:r>
         <w:r>
           <w:rPr>
@@ -4739,7 +4923,7 @@
           <w:rPr>
             <w:webHidden/>
           </w:rPr>
-          <w:t>6</w:t>
+          <w:t>7</w:t>
         </w:r>
         <w:r>
           <w:rPr>
@@ -4761,7 +4945,7 @@
           <w14:ligatures w14:val="standardContextual"/>
         </w:rPr>
       </w:pPr>
-      <w:hyperlink w:anchor="_Toc243744418" w:history="1">
+      <w:hyperlink w:anchor="_Toc243745067" w:history="1">
         <w:r>
           <w:rPr>
             <w:rStyle w:val="Hyperlink"/>
@@ -4784,7 +4968,7 @@
           <w:rPr>
             <w:webHidden/>
           </w:rPr>
-          <w:instrText xml:space="preserve"> PAGEREF _Toc243744418 \h </w:instrText>
+          <w:instrText xml:space="preserve"> PAGEREF _Toc243745067 \h </w:instrText>
         </w:r>
         <w:r>
           <w:rPr>
@@ -4801,7 +4985,7 @@
           <w:rPr>
             <w:webHidden/>
           </w:rPr>
-          <w:t>10</w:t>
+          <w:t>11</w:t>
         </w:r>
         <w:r>
           <w:rPr>
@@ -4823,7 +5007,7 @@
           <w14:ligatures w14:val="standardContextual"/>
         </w:rPr>
       </w:pPr>
-      <w:hyperlink w:anchor="_Toc243744419" w:history="1">
+      <w:hyperlink w:anchor="_Toc243745068" w:history="1">
         <w:r>
           <w:rPr>
             <w:rStyle w:val="Hyperlink"/>
@@ -4846,7 +5030,7 @@
           <w:rPr>
             <w:webHidden/>
           </w:rPr>
-          <w:instrText xml:space="preserve"> PAGEREF _Toc243744419 \h </w:instrText>
+          <w:instrText xml:space="preserve"> PAGEREF _Toc243745068 \h </w:instrText>
         </w:r>
         <w:r>
           <w:rPr>
@@ -4863,7 +5047,7 @@
           <w:rPr>
             <w:webHidden/>
           </w:rPr>
-          <w:t>12</w:t>
+          <w:t>13</w:t>
         </w:r>
         <w:r>
           <w:rPr>
@@ -4885,7 +5069,7 @@
           <w14:ligatures w14:val="standardContextual"/>
         </w:rPr>
       </w:pPr>
-      <w:hyperlink w:anchor="_Toc243744420" w:history="1">
+      <w:hyperlink w:anchor="_Toc243745069" w:history="1">
         <w:r>
           <w:rPr>
             <w:rStyle w:val="Hyperlink"/>
@@ -4908,7 +5092,7 @@
           <w:rPr>
             <w:webHidden/>
           </w:rPr>
-          <w:instrText xml:space="preserve"> PAGEREF _Toc243744420 \h </w:instrText>
+          <w:instrText xml:space="preserve"> PAGEREF _Toc243745069 \h </w:instrText>
         </w:r>
         <w:r>
           <w:rPr>
@@ -4925,7 +5109,7 @@
           <w:rPr>
             <w:webHidden/>
           </w:rPr>
-          <w:t>13</w:t>
+          <w:t>14</w:t>
         </w:r>
         <w:r>
           <w:rPr>
@@ -4947,7 +5131,7 @@
           <w14:ligatures w14:val="standardContextual"/>
         </w:rPr>
       </w:pPr>
-      <w:hyperlink w:anchor="_Toc243744421" w:history="1">
+      <w:hyperlink w:anchor="_Toc243745070" w:history="1">
         <w:r>
           <w:rPr>
             <w:rStyle w:val="Hyperlink"/>
@@ -4970,7 +5154,7 @@
           <w:rPr>
             <w:webHidden/>
           </w:rPr>
-          <w:instrText xml:space="preserve"> PAGEREF _Toc243744421 \h </w:instrText>
+          <w:instrText xml:space="preserve"> PAGEREF _Toc243745070 \h </w:instrText>
         </w:r>
         <w:r>
           <w:rPr>
@@ -4987,7 +5171,7 @@
           <w:rPr>
             <w:webHidden/>
           </w:rPr>
-          <w:t>16</w:t>
+          <w:t>17</w:t>
         </w:r>
         <w:r>
           <w:rPr>
@@ -5009,7 +5193,7 @@
           <w14:ligatures w14:val="standardContextual"/>
         </w:rPr>
       </w:pPr>
-      <w:hyperlink w:anchor="_Toc243744422" w:history="1">
+      <w:hyperlink w:anchor="_Toc243745071" w:history="1">
         <w:r>
           <w:rPr>
             <w:rStyle w:val="Hyperlink"/>
@@ -5032,7 +5216,7 @@
           <w:rPr>
             <w:webHidden/>
           </w:rPr>
-          <w:instrText xml:space="preserve"> PAGEREF _Toc243744422 \h </w:instrText>
+          <w:instrText xml:space="preserve"> PAGEREF _Toc243745071 \h </w:instrText>
         </w:r>
         <w:r>
           <w:rPr>
@@ -5049,7 +5233,7 @@
           <w:rPr>
             <w:webHidden/>
           </w:rPr>
-          <w:t>17</w:t>
+          <w:t>18</w:t>
         </w:r>
         <w:r>
           <w:rPr>
@@ -5071,7 +5255,7 @@
           <w14:ligatures w14:val="standardContextual"/>
         </w:rPr>
       </w:pPr>
-      <w:hyperlink w:anchor="_Toc243744423" w:history="1">
+      <w:hyperlink w:anchor="_Toc243745072" w:history="1">
         <w:r>
           <w:rPr>
             <w:rStyle w:val="Hyperlink"/>
@@ -5094,7 +5278,7 @@
           <w:rPr>
             <w:webHidden/>
           </w:rPr>
-          <w:instrText xml:space="preserve"> PAGEREF _Toc243744423 \h </w:instrText>
+          <w:instrText xml:space="preserve"> PAGEREF _Toc243745072 \h </w:instrText>
         </w:r>
         <w:r>
           <w:rPr>
@@ -5111,7 +5295,7 @@
           <w:rPr>
             <w:webHidden/>
           </w:rPr>
-          <w:t>19</w:t>
+          <w:t>20</w:t>
         </w:r>
         <w:r>
           <w:rPr>
@@ -5133,7 +5317,7 @@
           <w14:ligatures w14:val="standardContextual"/>
         </w:rPr>
       </w:pPr>
-      <w:hyperlink w:anchor="_Toc243744424" w:history="1">
+      <w:hyperlink w:anchor="_Toc243745073" w:history="1">
         <w:r>
           <w:rPr>
             <w:rStyle w:val="Hyperlink"/>
@@ -5156,7 +5340,7 @@
           <w:rPr>
             <w:webHidden/>
           </w:rPr>
-          <w:instrText xml:space="preserve"> PAGEREF _Toc243744424 \h </w:instrText>
+          <w:instrText xml:space="preserve"> PAGEREF _Toc243745073 \h </w:instrText>
         </w:r>
         <w:r>
           <w:rPr>
@@ -5173,7 +5357,7 @@
           <w:rPr>
             <w:webHidden/>
           </w:rPr>
-          <w:t>19</w:t>
+          <w:t>20</w:t>
         </w:r>
         <w:r>
           <w:rPr>
@@ -5195,7 +5379,7 @@
           <w14:ligatures w14:val="standardContextual"/>
         </w:rPr>
       </w:pPr>
-      <w:hyperlink w:anchor="_Toc243744425" w:history="1">
+      <w:hyperlink w:anchor="_Toc243745074" w:history="1">
         <w:r>
           <w:rPr>
             <w:rStyle w:val="Hyperlink"/>
@@ -5218,7 +5402,7 @@
           <w:rPr>
             <w:webHidden/>
           </w:rPr>
-          <w:instrText xml:space="preserve"> PAGEREF _Toc243744425 \h </w:instrText>
+          <w:instrText xml:space="preserve"> PAGEREF _Toc243745074 \h </w:instrText>
         </w:r>
         <w:r>
           <w:rPr>
@@ -5235,7 +5419,7 @@
           <w:rPr>
             <w:webHidden/>
           </w:rPr>
-          <w:t>22</w:t>
+          <w:t>23</w:t>
         </w:r>
         <w:r>
           <w:rPr>
@@ -5257,7 +5441,7 @@
           <w14:ligatures w14:val="standardContextual"/>
         </w:rPr>
       </w:pPr>
-      <w:hyperlink w:anchor="_Toc243744426" w:history="1">
+      <w:hyperlink w:anchor="_Toc243745075" w:history="1">
         <w:r>
           <w:rPr>
             <w:rStyle w:val="Hyperlink"/>
@@ -5280,7 +5464,7 @@
           <w:rPr>
             <w:webHidden/>
           </w:rPr>
-          <w:instrText xml:space="preserve"> PAGEREF _Toc243744426 \h </w:instrText>
+          <w:instrText xml:space="preserve"> PAGEREF _Toc243745075 \h </w:instrText>
         </w:r>
         <w:r>
           <w:rPr>
@@ -5297,7 +5481,7 @@
           <w:rPr>
             <w:webHidden/>
           </w:rPr>
-          <w:t>24</w:t>
+          <w:t>25</w:t>
         </w:r>
         <w:r>
           <w:rPr>
@@ -5319,7 +5503,7 @@
           <w14:ligatures w14:val="standardContextual"/>
         </w:rPr>
       </w:pPr>
-      <w:hyperlink w:anchor="_Toc243744427" w:history="1">
+      <w:hyperlink w:anchor="_Toc243745076" w:history="1">
         <w:r>
           <w:rPr>
             <w:rStyle w:val="Hyperlink"/>
@@ -5342,7 +5526,7 @@
           <w:rPr>
             <w:webHidden/>
           </w:rPr>
-          <w:instrText xml:space="preserve"> PAGEREF _Toc243744427 \h </w:instrText>
+          <w:instrText xml:space="preserve"> PAGEREF _Toc243745076 \h </w:instrText>
         </w:r>
         <w:r>
           <w:rPr>
@@ -5359,7 +5543,7 @@
           <w:rPr>
             <w:webHidden/>
           </w:rPr>
-          <w:t>25</w:t>
+          <w:t>26</w:t>
         </w:r>
         <w:r>
           <w:rPr>
@@ -5381,7 +5565,7 @@
           <w14:ligatures w14:val="standardContextual"/>
         </w:rPr>
       </w:pPr>
-      <w:hyperlink w:anchor="_Toc243744428" w:history="1">
+      <w:hyperlink w:anchor="_Toc243745077" w:history="1">
         <w:r>
           <w:rPr>
             <w:rStyle w:val="Hyperlink"/>
@@ -5404,7 +5588,7 @@
           <w:rPr>
             <w:webHidden/>
           </w:rPr>
-          <w:instrText xml:space="preserve"> PAGEREF _Toc243744428 \h </w:instrText>
+          <w:instrText xml:space="preserve"> PAGEREF _Toc243745077 \h </w:instrText>
         </w:r>
         <w:r>
           <w:rPr>
@@ -5421,7 +5605,7 @@
           <w:rPr>
             <w:webHidden/>
           </w:rPr>
-          <w:t>25</w:t>
+          <w:t>26</w:t>
         </w:r>
         <w:r>
           <w:rPr>
@@ -5443,7 +5627,7 @@
           <w14:ligatures w14:val="standardContextual"/>
         </w:rPr>
       </w:pPr>
-      <w:hyperlink w:anchor="_Toc243744429" w:history="1">
+      <w:hyperlink w:anchor="_Toc243745078" w:history="1">
         <w:r>
           <w:rPr>
             <w:rStyle w:val="Hyperlink"/>
@@ -5466,7 +5650,7 @@
           <w:rPr>
             <w:webHidden/>
           </w:rPr>
-          <w:instrText xml:space="preserve"> PAGEREF _Toc243744429 \h </w:instrText>
+          <w:instrText xml:space="preserve"> PAGEREF _Toc243745078 \h </w:instrText>
         </w:r>
         <w:r>
           <w:rPr>
@@ -5483,7 +5667,7 @@
           <w:rPr>
             <w:webHidden/>
           </w:rPr>
-          <w:t>26</w:t>
+          <w:t>27</w:t>
         </w:r>
         <w:r>
           <w:rPr>
@@ -5505,7 +5689,7 @@
           <w14:ligatures w14:val="standardContextual"/>
         </w:rPr>
       </w:pPr>
-      <w:hyperlink w:anchor="_Toc243744430" w:history="1">
+      <w:hyperlink w:anchor="_Toc243745079" w:history="1">
         <w:r>
           <w:rPr>
             <w:rStyle w:val="Hyperlink"/>
@@ -5528,7 +5712,7 @@
           <w:rPr>
             <w:webHidden/>
           </w:rPr>
-          <w:instrText xml:space="preserve"> PAGEREF _Toc243744430 \h </w:instrText>
+          <w:instrText xml:space="preserve"> PAGEREF _Toc243745079 \h </w:instrText>
         </w:r>
         <w:r>
           <w:rPr>
@@ -5545,7 +5729,7 @@
           <w:rPr>
             <w:webHidden/>
           </w:rPr>
-          <w:t>26</w:t>
+          <w:t>27</w:t>
         </w:r>
         <w:r>
           <w:rPr>
@@ -5567,7 +5751,7 @@
           <w14:ligatures w14:val="standardContextual"/>
         </w:rPr>
       </w:pPr>
-      <w:hyperlink w:anchor="_Toc243744431" w:history="1">
+      <w:hyperlink w:anchor="_Toc243745080" w:history="1">
         <w:r>
           <w:rPr>
             <w:rStyle w:val="Hyperlink"/>
@@ -5590,7 +5774,7 @@
           <w:rPr>
             <w:webHidden/>
           </w:rPr>
-          <w:instrText xml:space="preserve"> PAGEREF _Toc243744431 \h </w:instrText>
+          <w:instrText xml:space="preserve"> PAGEREF _Toc243745080 \h </w:instrText>
         </w:r>
         <w:r>
           <w:rPr>
@@ -5607,7 +5791,7 @@
           <w:rPr>
             <w:webHidden/>
           </w:rPr>
-          <w:t>27</w:t>
+          <w:t>28</w:t>
         </w:r>
         <w:r>
           <w:rPr>
@@ -5629,7 +5813,7 @@
           <w14:ligatures w14:val="standardContextual"/>
         </w:rPr>
       </w:pPr>
-      <w:hyperlink w:anchor="_Toc243744432" w:history="1">
+      <w:hyperlink w:anchor="_Toc243745081" w:history="1">
         <w:r>
           <w:rPr>
             <w:rStyle w:val="Hyperlink"/>
@@ -5652,7 +5836,7 @@
           <w:rPr>
             <w:webHidden/>
           </w:rPr>
-          <w:instrText xml:space="preserve"> PAGEREF _Toc243744432 \h </w:instrText>
+          <w:instrText xml:space="preserve"> PAGEREF _Toc243745081 \h </w:instrText>
         </w:r>
         <w:r>
           <w:rPr>
@@ -5669,7 +5853,7 @@
           <w:rPr>
             <w:webHidden/>
           </w:rPr>
-          <w:t>27</w:t>
+          <w:t>28</w:t>
         </w:r>
         <w:r>
           <w:rPr>
@@ -5691,7 +5875,7 @@
           <w14:ligatures w14:val="standardContextual"/>
         </w:rPr>
       </w:pPr>
-      <w:hyperlink w:anchor="_Toc243744433" w:history="1">
+      <w:hyperlink w:anchor="_Toc243745082" w:history="1">
         <w:r>
           <w:rPr>
             <w:rStyle w:val="Hyperlink"/>
@@ -5714,7 +5898,7 @@
           <w:rPr>
             <w:webHidden/>
           </w:rPr>
-          <w:instrText xml:space="preserve"> PAGEREF _Toc243744433 \h </w:instrText>
+          <w:instrText xml:space="preserve"> PAGEREF _Toc243745082 \h </w:instrText>
         </w:r>
         <w:r>
           <w:rPr>
@@ -5731,7 +5915,7 @@
           <w:rPr>
             <w:webHidden/>
           </w:rPr>
-          <w:t>28</w:t>
+          <w:t>29</w:t>
         </w:r>
         <w:r>
           <w:rPr>
@@ -5753,7 +5937,7 @@
           <w14:ligatures w14:val="standardContextual"/>
         </w:rPr>
       </w:pPr>
-      <w:hyperlink w:anchor="_Toc243744434" w:history="1">
+      <w:hyperlink w:anchor="_Toc243745083" w:history="1">
         <w:r>
           <w:rPr>
             <w:rStyle w:val="Hyperlink"/>
@@ -5776,7 +5960,7 @@
           <w:rPr>
             <w:webHidden/>
           </w:rPr>
-          <w:instrText xml:space="preserve"> PAGEREF _Toc243744434 \h </w:instrText>
+          <w:instrText xml:space="preserve"> PAGEREF _Toc243745083 \h </w:instrText>
         </w:r>
         <w:r>
           <w:rPr>
@@ -5793,7 +5977,7 @@
           <w:rPr>
             <w:webHidden/>
           </w:rPr>
-          <w:t>28</w:t>
+          <w:t>29</w:t>
         </w:r>
         <w:r>
           <w:rPr>
@@ -5815,7 +5999,7 @@
           <w14:ligatures w14:val="standardContextual"/>
         </w:rPr>
       </w:pPr>
-      <w:hyperlink w:anchor="_Toc243744435" w:history="1">
+      <w:hyperlink w:anchor="_Toc243745084" w:history="1">
         <w:r>
           <w:rPr>
             <w:rStyle w:val="Hyperlink"/>
@@ -5838,7 +6022,7 @@
           <w:rPr>
             <w:webHidden/>
           </w:rPr>
-          <w:instrText xml:space="preserve"> PAGEREF _Toc243744435 \h </w:instrText>
+          <w:instrText xml:space="preserve"> PAGEREF _Toc243745084 \h </w:instrText>
         </w:r>
         <w:r>
           <w:rPr>
@@ -5855,7 +6039,7 @@
           <w:rPr>
             <w:webHidden/>
           </w:rPr>
-          <w:t>28</w:t>
+          <w:t>29</w:t>
         </w:r>
         <w:r>
           <w:rPr>
@@ -5877,7 +6061,7 @@
           <w14:ligatures w14:val="standardContextual"/>
         </w:rPr>
       </w:pPr>
-      <w:hyperlink w:anchor="_Toc243744436" w:history="1">
+      <w:hyperlink w:anchor="_Toc243745085" w:history="1">
         <w:r>
           <w:rPr>
             <w:rStyle w:val="Hyperlink"/>
@@ -5900,7 +6084,7 @@
           <w:rPr>
             <w:webHidden/>
           </w:rPr>
-          <w:instrText xml:space="preserve"> PAGEREF _Toc243744436 \h </w:instrText>
+          <w:instrText xml:space="preserve"> PAGEREF _Toc243745085 \h </w:instrText>
         </w:r>
         <w:r>
           <w:rPr>
@@ -5917,7 +6101,7 @@
           <w:rPr>
             <w:webHidden/>
           </w:rPr>
-          <w:t>35</w:t>
+          <w:t>36</w:t>
         </w:r>
         <w:r>
           <w:rPr>
@@ -5939,7 +6123,7 @@
           <w14:ligatures w14:val="standardContextual"/>
         </w:rPr>
       </w:pPr>
-      <w:hyperlink w:anchor="_Toc243744437" w:history="1">
+      <w:hyperlink w:anchor="_Toc243745086" w:history="1">
         <w:r>
           <w:rPr>
             <w:rStyle w:val="Hyperlink"/>
@@ -5962,7 +6146,7 @@
           <w:rPr>
             <w:webHidden/>
           </w:rPr>
-          <w:instrText xml:space="preserve"> PAGEREF _Toc243744437 \h </w:instrText>
+          <w:instrText xml:space="preserve"> PAGEREF _Toc243745086 \h </w:instrText>
         </w:r>
         <w:r>
           <w:rPr>
@@ -5979,7 +6163,7 @@
           <w:rPr>
             <w:webHidden/>
           </w:rPr>
-          <w:t>38</w:t>
+          <w:t>39</w:t>
         </w:r>
         <w:r>
           <w:rPr>
@@ -6003,21 +6187,21 @@
       <w:pPr>
         <w:pStyle w:val="Heading1"/>
       </w:pPr>
-      <w:bookmarkStart w:id="6" w:name="_Toc243744359"/>
+      <w:bookmarkStart w:id="8" w:name="_Toc243745008"/>
       <w:r>
         <w:t>List of Symbols and Acronyms</w:t>
       </w:r>
-      <w:bookmarkEnd w:id="6"/>
+      <w:bookmarkEnd w:id="8"/>
     </w:p>
     <w:p>
       <w:pPr>
         <w:pStyle w:val="TableCaption"/>
       </w:pPr>
-      <w:bookmarkStart w:id="7" w:name="_Toc243744416"/>
+      <w:bookmarkStart w:id="9" w:name="_Toc243745065"/>
       <w:r>
         <w:t>Symbols and acronyms</w:t>
       </w:r>
-      <w:bookmarkEnd w:id="7"/>
+      <w:bookmarkEnd w:id="9"/>
     </w:p>
     <w:tbl>
       <w:tblPr>
@@ -6484,21 +6668,21 @@
       <w:pPr>
         <w:pStyle w:val="Heading1"/>
       </w:pPr>
-      <w:bookmarkStart w:id="8" w:name="_Toc243744360"/>
+      <w:bookmarkStart w:id="10" w:name="_Toc243745009"/>
       <w:r>
         <w:t>Chapter 1 Introduction</w:t>
       </w:r>
-      <w:bookmarkEnd w:id="8"/>
+      <w:bookmarkEnd w:id="10"/>
     </w:p>
     <w:p>
       <w:pPr>
         <w:pStyle w:val="Heading2"/>
       </w:pPr>
-      <w:bookmarkStart w:id="9" w:name="_Toc243744361"/>
+      <w:bookmarkStart w:id="11" w:name="_Toc243745010"/>
       <w:r>
         <w:t>1.1 Background</w:t>
       </w:r>
-      <w:bookmarkEnd w:id="9"/>
+      <w:bookmarkEnd w:id="11"/>
     </w:p>
     <w:p>
       <w:r>
@@ -6512,11 +6696,32 @@
       <w:pPr>
         <w:pStyle w:val="Heading2"/>
       </w:pPr>
-      <w:bookmarkStart w:id="10" w:name="_Toc243744362"/>
+      <w:bookmarkStart w:id="12" w:name="_Toc243745011"/>
       <w:r>
         <w:t>1.2 Research Motivation</w:t>
       </w:r>
-      <w:bookmarkEnd w:id="10"/>
+      <w:bookmarkEnd w:id="12"/>
+    </w:p>
+    <w:p>
+      <w:r>
+        <w:t>My motivation for this Praxis comes from my service in Army Cyber. As a Cyber Protection Team (CPT) leader in the Army Reserve, I have conducted traditional and cloud-based hunt missions against adversary activity in defense networks. These experiences, described in my earlier GML Praxis paper, shaped my interest in the gap between the activity that detection tools surface and the evidence that skilled adversaries leave behind. I want this research to support the people responsible for finding and investiga</w:t>
+      </w:r>
+      <w:r>
+        <w:t>ting that activity.</w:t>
+      </w:r>
+    </w:p>
+    <w:p>
+      <w:r>
+        <w:t>The operational audience includes security operations center (SOC) analysts and CPT members hunting advanced persistent threats. Their work depends on interpreting incomplete host and network evidence, prioritizing suspicious activity and deciding where further investigation is warranted. As autonomous AI enters the threat landscape, I want to determine whether observable behavior can provide a reliable indication of how an intrusion is being operated. A useful result would help defenders assess evidence an</w:t>
+      </w:r>
+      <w:r>
+        <w:t>d its uncertainty while avoiding unsupported conclusions based on speed, tool names or isolated events.</w:t>
+      </w:r>
+    </w:p>
+    <w:p>
+      <w:r>
+        <w:t>This Praxis carries forward the purpose of my GML work: connecting academic research with operational cyber defense. Its present focus is human-versus-autonomous-AI classification within controlled APT-like scenarios. It does not claim that operator classification by itself detects every APT, identifies a threat group or supplies a deployment-ready SOC capability. The intended contribution is an evidence-based foundation that SOC analysts and CPTs can evaluate for future hunting and investigative support.</w:t>
+      </w:r>
     </w:p>
     <w:p>
       <w:r>
@@ -6530,11 +6735,11 @@
       <w:pPr>
         <w:pStyle w:val="Heading2"/>
       </w:pPr>
-      <w:bookmarkStart w:id="11" w:name="_Toc243744363"/>
+      <w:bookmarkStart w:id="13" w:name="_Toc243745012"/>
       <w:r>
         <w:t>1.3 Problem Statement</w:t>
       </w:r>
-      <w:bookmarkEnd w:id="11"/>
+      <w:bookmarkEnd w:id="13"/>
     </w:p>
     <w:p>
       <w:r>
@@ -6548,11 +6753,11 @@
       <w:pPr>
         <w:pStyle w:val="Heading2"/>
       </w:pPr>
-      <w:bookmarkStart w:id="12" w:name="_Toc243744364"/>
+      <w:bookmarkStart w:id="14" w:name="_Toc243745013"/>
       <w:r>
         <w:t>1.4 Thesis Statement</w:t>
       </w:r>
-      <w:bookmarkEnd w:id="12"/>
+      <w:bookmarkEnd w:id="14"/>
     </w:p>
     <w:p>
       <w:r>
@@ -6571,11 +6776,11 @@
       <w:pPr>
         <w:pStyle w:val="Heading2"/>
       </w:pPr>
-      <w:bookmarkStart w:id="13" w:name="_Toc243744365"/>
+      <w:bookmarkStart w:id="15" w:name="_Toc243745014"/>
       <w:r>
         <w:t>1.5 Research Objectives</w:t>
       </w:r>
-      <w:bookmarkEnd w:id="13"/>
+      <w:bookmarkEnd w:id="15"/>
     </w:p>
     <w:p>
       <w:r>
@@ -6586,11 +6791,11 @@
       <w:pPr>
         <w:pStyle w:val="Heading2"/>
       </w:pPr>
-      <w:bookmarkStart w:id="14" w:name="_Toc243744366"/>
+      <w:bookmarkStart w:id="16" w:name="_Toc243745015"/>
       <w:r>
         <w:t>1.6 Research Questions and Hypotheses</w:t>
       </w:r>
-      <w:bookmarkEnd w:id="14"/>
+      <w:bookmarkEnd w:id="16"/>
     </w:p>
     <w:p>
       <w:r>
@@ -6631,11 +6836,11 @@
       <w:pPr>
         <w:pStyle w:val="Heading2"/>
       </w:pPr>
-      <w:bookmarkStart w:id="15" w:name="_Toc243744367"/>
+      <w:bookmarkStart w:id="17" w:name="_Toc243745016"/>
       <w:r>
         <w:t>1.7 Scope of Research</w:t>
       </w:r>
-      <w:bookmarkEnd w:id="15"/>
+      <w:bookmarkEnd w:id="17"/>
     </w:p>
     <w:p>
       <w:r>
@@ -6651,11 +6856,11 @@
       <w:pPr>
         <w:pStyle w:val="Heading2"/>
       </w:pPr>
-      <w:bookmarkStart w:id="16" w:name="_Toc243744368"/>
+      <w:bookmarkStart w:id="18" w:name="_Toc243745017"/>
       <w:r>
         <w:t>1.8 Research Limitations</w:t>
       </w:r>
-      <w:bookmarkEnd w:id="16"/>
+      <w:bookmarkEnd w:id="18"/>
     </w:p>
     <w:p>
       <w:r>
@@ -6666,11 +6871,11 @@
       <w:pPr>
         <w:pStyle w:val="Heading2"/>
       </w:pPr>
-      <w:bookmarkStart w:id="17" w:name="_Toc243744369"/>
+      <w:bookmarkStart w:id="19" w:name="_Toc243745018"/>
       <w:r>
         <w:t>1.9 Organization of Praxis</w:t>
       </w:r>
-      <w:bookmarkEnd w:id="17"/>
+      <w:bookmarkEnd w:id="19"/>
     </w:p>
     <w:p>
       <w:r>
@@ -6686,21 +6891,21 @@
       <w:pPr>
         <w:pStyle w:val="Heading1"/>
       </w:pPr>
-      <w:bookmarkStart w:id="18" w:name="_Toc243744370"/>
+      <w:bookmarkStart w:id="20" w:name="_Toc243745019"/>
       <w:r>
         <w:t>Chapter 2 Literature Review</w:t>
       </w:r>
-      <w:bookmarkEnd w:id="18"/>
+      <w:bookmarkEnd w:id="20"/>
     </w:p>
     <w:p>
       <w:pPr>
         <w:pStyle w:val="Heading2"/>
       </w:pPr>
-      <w:bookmarkStart w:id="19" w:name="_Toc243744371"/>
+      <w:bookmarkStart w:id="21" w:name="_Toc243745020"/>
       <w:r>
         <w:t>2.1 Review Method and Evidence Status</w:t>
       </w:r>
-      <w:bookmarkEnd w:id="19"/>
+      <w:bookmarkEnd w:id="21"/>
     </w:p>
     <w:p>
       <w:r>
@@ -6719,11 +6924,11 @@
       <w:pPr>
         <w:pStyle w:val="Heading2"/>
       </w:pPr>
-      <w:bookmarkStart w:id="20" w:name="_Toc243744372"/>
+      <w:bookmarkStart w:id="22" w:name="_Toc243745021"/>
       <w:r>
         <w:t>2.2 Automation Classes and AI Fingerprints</w:t>
       </w:r>
-      <w:bookmarkEnd w:id="20"/>
+      <w:bookmarkEnd w:id="22"/>
     </w:p>
     <w:p>
       <w:r>
@@ -6739,11 +6944,11 @@
       <w:pPr>
         <w:pStyle w:val="Heading2"/>
       </w:pPr>
-      <w:bookmarkStart w:id="21" w:name="_Toc243744373"/>
+      <w:bookmarkStart w:id="23" w:name="_Toc243745022"/>
       <w:r>
         <w:t>2.3 Recent Behavioral and Deception Research</w:t>
       </w:r>
-      <w:bookmarkEnd w:id="21"/>
+      <w:bookmarkEnd w:id="23"/>
     </w:p>
     <w:p>
       <w:r>
@@ -6764,11 +6969,11 @@
       <w:pPr>
         <w:pStyle w:val="Heading2"/>
       </w:pPr>
-      <w:bookmarkStart w:id="22" w:name="_Toc243744374"/>
+      <w:bookmarkStart w:id="24" w:name="_Toc243745023"/>
       <w:r>
         <w:t>2.4 Data and Experimental Infrastructure</w:t>
       </w:r>
-      <w:bookmarkEnd w:id="22"/>
+      <w:bookmarkEnd w:id="24"/>
     </w:p>
     <w:p>
       <w:r>
@@ -6789,11 +6994,11 @@
       <w:pPr>
         <w:pStyle w:val="Heading2"/>
       </w:pPr>
-      <w:bookmarkStart w:id="23" w:name="_Toc243744375"/>
+      <w:bookmarkStart w:id="25" w:name="_Toc243745024"/>
       <w:r>
         <w:t>2.5 Models and Evaluation</w:t>
       </w:r>
-      <w:bookmarkEnd w:id="23"/>
+      <w:bookmarkEnd w:id="25"/>
     </w:p>
     <w:p>
       <w:r>
@@ -6812,11 +7017,11 @@
       <w:pPr>
         <w:pStyle w:val="TableCaption"/>
       </w:pPr>
-      <w:bookmarkStart w:id="24" w:name="_Toc243744417"/>
+      <w:bookmarkStart w:id="26" w:name="_Toc243745066"/>
       <w:r>
         <w:t>Table 2.1 Closest literature and proposed extension</w:t>
       </w:r>
-      <w:bookmarkEnd w:id="24"/>
+      <w:bookmarkEnd w:id="26"/>
     </w:p>
     <w:tbl>
       <w:tblPr>
@@ -7330,11 +7535,11 @@
       <w:pPr>
         <w:pStyle w:val="Heading2"/>
       </w:pPr>
-      <w:bookmarkStart w:id="25" w:name="_Toc243744376"/>
+      <w:bookmarkStart w:id="27" w:name="_Toc243745025"/>
       <w:r>
         <w:t>2.6 Novelty Synthesis</w:t>
       </w:r>
-      <w:bookmarkEnd w:id="25"/>
+      <w:bookmarkEnd w:id="27"/>
     </w:p>
     <w:p>
       <w:r>
@@ -7353,21 +7558,21 @@
       <w:pPr>
         <w:pStyle w:val="Heading1"/>
       </w:pPr>
-      <w:bookmarkStart w:id="26" w:name="_Toc243744377"/>
+      <w:bookmarkStart w:id="28" w:name="_Toc243745026"/>
       <w:r>
         <w:t>Chapter 3 Methodology</w:t>
       </w:r>
-      <w:bookmarkEnd w:id="26"/>
+      <w:bookmarkEnd w:id="28"/>
     </w:p>
     <w:p>
       <w:pPr>
         <w:pStyle w:val="Heading2"/>
       </w:pPr>
-      <w:bookmarkStart w:id="27" w:name="_Toc243744378"/>
+      <w:bookmarkStart w:id="29" w:name="_Toc243745027"/>
       <w:r>
         <w:t>3.1 Design and Data Provenance</w:t>
       </w:r>
-      <w:bookmarkEnd w:id="27"/>
+      <w:bookmarkEnd w:id="29"/>
     </w:p>
     <w:p>
       <w:r>
@@ -7399,11 +7604,11 @@
       <w:pPr>
         <w:pStyle w:val="Heading2"/>
       </w:pPr>
-      <w:bookmarkStart w:id="28" w:name="_Toc243744379"/>
+      <w:bookmarkStart w:id="30" w:name="_Toc243745028"/>
       <w:r>
         <w:t>3.2 AWS Range and External Agent</w:t>
       </w:r>
-      <w:bookmarkEnd w:id="28"/>
+      <w:bookmarkEnd w:id="30"/>
     </w:p>
     <w:p>
       <w:r>
@@ -7481,21 +7686,21 @@
       <w:pPr>
         <w:pStyle w:val="FigureCaption"/>
       </w:pPr>
-      <w:bookmarkStart w:id="29" w:name="_Toc243744414"/>
+      <w:bookmarkStart w:id="31" w:name="_Toc243745063"/>
       <w:r>
         <w:t>Figure 3.1 Proposed collection architecture</w:t>
       </w:r>
-      <w:bookmarkEnd w:id="29"/>
+      <w:bookmarkEnd w:id="31"/>
     </w:p>
     <w:p>
       <w:pPr>
         <w:pStyle w:val="TableCaption"/>
       </w:pPr>
-      <w:bookmarkStart w:id="30" w:name="_Toc243744418"/>
+      <w:bookmarkStart w:id="32" w:name="_Toc243745067"/>
       <w:r>
         <w:t>Table 3.1 Configuration and evidence requirements</w:t>
       </w:r>
-      <w:bookmarkEnd w:id="30"/>
+      <w:bookmarkEnd w:id="32"/>
     </w:p>
     <w:tbl>
       <w:tblPr>
@@ -7949,11 +8154,11 @@
       <w:pPr>
         <w:pStyle w:val="Heading2"/>
       </w:pPr>
-      <w:bookmarkStart w:id="31" w:name="_Toc243744380"/>
+      <w:bookmarkStart w:id="33" w:name="_Toc243745029"/>
       <w:r>
         <w:t>3.2.1 Recorded Configuration and Calibration</w:t>
       </w:r>
-      <w:bookmarkEnd w:id="31"/>
+      <w:bookmarkEnd w:id="33"/>
     </w:p>
     <w:p>
       <w:r>
@@ -7975,11 +8180,11 @@
       <w:pPr>
         <w:pStyle w:val="Heading2"/>
       </w:pPr>
-      <w:bookmarkStart w:id="32" w:name="_Toc243744381"/>
+      <w:bookmarkStart w:id="34" w:name="_Toc243745030"/>
       <w:r>
         <w:t>3.2.2 Development Scenarios and Acceptance Boundary</w:t>
       </w:r>
-      <w:bookmarkEnd w:id="32"/>
+      <w:bookmarkEnd w:id="34"/>
     </w:p>
     <w:p>
       <w:r>
@@ -8001,11 +8206,11 @@
       <w:pPr>
         <w:pStyle w:val="Heading2"/>
       </w:pPr>
-      <w:bookmarkStart w:id="33" w:name="_Toc243744382"/>
+      <w:bookmarkStart w:id="35" w:name="_Toc243745031"/>
       <w:r>
         <w:t>3.3 Graphical Model Representation</w:t>
       </w:r>
-      <w:bookmarkEnd w:id="33"/>
+      <w:bookmarkEnd w:id="35"/>
     </w:p>
     <w:p>
       <w:pPr>
@@ -8057,11 +8262,11 @@
       <w:pPr>
         <w:pStyle w:val="FigureCaption"/>
       </w:pPr>
-      <w:bookmarkStart w:id="34" w:name="_Toc243744415"/>
+      <w:bookmarkStart w:id="36" w:name="_Toc243745064"/>
       <w:r>
         <w:t>Figure 3.2 Graphical model of research in six stages</w:t>
       </w:r>
-      <w:bookmarkEnd w:id="34"/>
+      <w:bookmarkEnd w:id="36"/>
     </w:p>
     <w:p>
       <w:r>
@@ -8077,11 +8282,11 @@
       <w:pPr>
         <w:pStyle w:val="TableCaption"/>
       </w:pPr>
-      <w:bookmarkStart w:id="35" w:name="_Toc243744419"/>
+      <w:bookmarkStart w:id="37" w:name="_Toc243745068"/>
       <w:r>
         <w:t>Table 3.2 GMR alignment with objectives</w:t>
       </w:r>
-      <w:bookmarkEnd w:id="35"/>
+      <w:bookmarkEnd w:id="37"/>
     </w:p>
     <w:tbl>
       <w:tblPr>
@@ -8475,11 +8680,11 @@
       <w:pPr>
         <w:pStyle w:val="Heading2"/>
       </w:pPr>
-      <w:bookmarkStart w:id="36" w:name="_Toc243744383"/>
+      <w:bookmarkStart w:id="38" w:name="_Toc243745032"/>
       <w:r>
         <w:t>3.4 Five Day Collection Protocol</w:t>
       </w:r>
-      <w:bookmarkEnd w:id="36"/>
+      <w:bookmarkEnd w:id="38"/>
     </w:p>
     <w:p>
       <w:r>
@@ -8498,11 +8703,11 @@
       <w:pPr>
         <w:pStyle w:val="TableCaption"/>
       </w:pPr>
-      <w:bookmarkStart w:id="37" w:name="_Toc243744420"/>
+      <w:bookmarkStart w:id="39" w:name="_Toc243745069"/>
       <w:r>
         <w:t>Table 3.3 Five day collection schedule</w:t>
       </w:r>
-      <w:bookmarkEnd w:id="37"/>
+      <w:bookmarkEnd w:id="39"/>
     </w:p>
     <w:tbl>
       <w:tblPr>
@@ -8916,11 +9121,11 @@
       <w:pPr>
         <w:pStyle w:val="Heading2"/>
       </w:pPr>
-      <w:bookmarkStart w:id="38" w:name="_Toc243744384"/>
+      <w:bookmarkStart w:id="40" w:name="_Toc243745033"/>
       <w:r>
         <w:t>3.5 Ground Truth and Validation</w:t>
       </w:r>
-      <w:bookmarkEnd w:id="38"/>
+      <w:bookmarkEnd w:id="40"/>
     </w:p>
     <w:p>
       <w:r>
@@ -8939,11 +9144,11 @@
       <w:pPr>
         <w:pStyle w:val="Heading2"/>
       </w:pPr>
-      <w:bookmarkStart w:id="39" w:name="_Toc243744385"/>
+      <w:bookmarkStart w:id="41" w:name="_Toc243745034"/>
       <w:r>
         <w:t>3.5.1 Evidence Layers and Annotation</w:t>
       </w:r>
-      <w:bookmarkEnd w:id="39"/>
+      <w:bookmarkEnd w:id="41"/>
     </w:p>
     <w:p>
       <w:r>
@@ -8973,11 +9178,11 @@
       <w:pPr>
         <w:pStyle w:val="Heading2"/>
       </w:pPr>
-      <w:bookmarkStart w:id="40" w:name="_Toc243744386"/>
+      <w:bookmarkStart w:id="42" w:name="_Toc243745035"/>
       <w:r>
         <w:t>3.5.2 Isolation and Remaining Development Gates</w:t>
       </w:r>
-      <w:bookmarkEnd w:id="40"/>
+      <w:bookmarkEnd w:id="42"/>
     </w:p>
     <w:p>
       <w:r>
@@ -8999,11 +9204,11 @@
       <w:pPr>
         <w:pStyle w:val="Heading2"/>
       </w:pPr>
-      <w:bookmarkStart w:id="41" w:name="_Toc243744387"/>
+      <w:bookmarkStart w:id="43" w:name="_Toc243745036"/>
       <w:r>
         <w:t>3.6 Exploratory Data Analysis</w:t>
       </w:r>
-      <w:bookmarkEnd w:id="41"/>
+      <w:bookmarkEnd w:id="43"/>
     </w:p>
     <w:p>
       <w:r>
@@ -9024,11 +9229,11 @@
       <w:pPr>
         <w:pStyle w:val="TableCaption"/>
       </w:pPr>
-      <w:bookmarkStart w:id="42" w:name="_Toc243744421"/>
+      <w:bookmarkStart w:id="44" w:name="_Toc243745070"/>
       <w:r>
         <w:t>Table 3.4 EDA outputs</w:t>
       </w:r>
-      <w:bookmarkEnd w:id="42"/>
+      <w:bookmarkEnd w:id="44"/>
     </w:p>
     <w:tbl>
       <w:tblPr>
@@ -9602,11 +9807,11 @@
       <w:pPr>
         <w:pStyle w:val="Heading2"/>
       </w:pPr>
-      <w:bookmarkStart w:id="43" w:name="_Toc243744388"/>
+      <w:bookmarkStart w:id="45" w:name="_Toc243745037"/>
       <w:r>
         <w:t>3.7 Feature Engineering</w:t>
       </w:r>
-      <w:bookmarkEnd w:id="43"/>
+      <w:bookmarkEnd w:id="45"/>
     </w:p>
     <w:p>
       <w:r>
@@ -9622,11 +9827,11 @@
       <w:pPr>
         <w:pStyle w:val="TableCaption"/>
       </w:pPr>
-      <w:bookmarkStart w:id="44" w:name="_Toc243744422"/>
+      <w:bookmarkStart w:id="46" w:name="_Toc243745071"/>
       <w:r>
         <w:t>Table 3.5 Feature dictionary draft</w:t>
       </w:r>
-      <w:bookmarkEnd w:id="44"/>
+      <w:bookmarkEnd w:id="46"/>
     </w:p>
     <w:tbl>
       <w:tblPr>
@@ -10145,11 +10350,11 @@
       <w:pPr>
         <w:pStyle w:val="Heading2"/>
       </w:pPr>
-      <w:bookmarkStart w:id="45" w:name="_Toc243744389"/>
+      <w:bookmarkStart w:id="47" w:name="_Toc243745038"/>
       <w:r>
         <w:t>3.8 Grouped Evaluation and Baselines</w:t>
       </w:r>
-      <w:bookmarkEnd w:id="45"/>
+      <w:bookmarkEnd w:id="47"/>
     </w:p>
     <w:p>
       <w:r>
@@ -10179,11 +10384,11 @@
       <w:pPr>
         <w:pStyle w:val="Heading2"/>
       </w:pPr>
-      <w:bookmarkStart w:id="46" w:name="_Toc243744390"/>
+      <w:bookmarkStart w:id="48" w:name="_Toc243745039"/>
       <w:r>
         <w:t>3.9 How the Classifiers Work</w:t>
       </w:r>
-      <w:bookmarkEnd w:id="46"/>
+      <w:bookmarkEnd w:id="48"/>
     </w:p>
     <w:p>
       <w:r>
@@ -10209,11 +10414,11 @@
       <w:pPr>
         <w:pStyle w:val="TableCaption"/>
       </w:pPr>
-      <w:bookmarkStart w:id="47" w:name="_Toc243744423"/>
+      <w:bookmarkStart w:id="49" w:name="_Toc243745072"/>
       <w:r>
         <w:t>Table 3.6 Tuning specification</w:t>
       </w:r>
-      <w:bookmarkEnd w:id="47"/>
+      <w:bookmarkEnd w:id="49"/>
     </w:p>
     <w:tbl>
       <w:tblPr>
@@ -10667,11 +10872,11 @@
       <w:pPr>
         <w:pStyle w:val="Heading2"/>
       </w:pPr>
-      <w:bookmarkStart w:id="48" w:name="_Toc243744391"/>
+      <w:bookmarkStart w:id="50" w:name="_Toc243745040"/>
       <w:r>
         <w:t>3.10 Equations and Metrics</w:t>
       </w:r>
-      <w:bookmarkEnd w:id="48"/>
+      <w:bookmarkEnd w:id="50"/>
     </w:p>
     <w:p>
       <w:r>
@@ -10682,11 +10887,11 @@
       <w:pPr>
         <w:pStyle w:val="TableCaption"/>
       </w:pPr>
-      <w:bookmarkStart w:id="49" w:name="_Toc243744424"/>
+      <w:bookmarkStart w:id="51" w:name="_Toc243745073"/>
       <w:r>
         <w:t>Table 3.7 Equation register</w:t>
       </w:r>
-      <w:bookmarkEnd w:id="49"/>
+      <w:bookmarkEnd w:id="51"/>
     </w:p>
     <w:tbl>
       <w:tblPr>
@@ -12741,11 +12946,11 @@
       <w:pPr>
         <w:pStyle w:val="Heading2"/>
       </w:pPr>
-      <w:bookmarkStart w:id="50" w:name="_Toc243744392"/>
+      <w:bookmarkStart w:id="52" w:name="_Toc243745041"/>
       <w:r>
         <w:t>3.11 Hypothesis Decision Framework</w:t>
       </w:r>
-      <w:bookmarkEnd w:id="50"/>
+      <w:bookmarkEnd w:id="52"/>
     </w:p>
     <w:p>
       <w:r>
@@ -12769,11 +12974,11 @@
       <w:pPr>
         <w:pStyle w:val="TableCaption"/>
       </w:pPr>
-      <w:bookmarkStart w:id="51" w:name="_Toc243744425"/>
+      <w:bookmarkStart w:id="53" w:name="_Toc243745074"/>
       <w:r>
         <w:t>Table 3.8 Required evidence for success</w:t>
       </w:r>
-      <w:bookmarkEnd w:id="51"/>
+      <w:bookmarkEnd w:id="53"/>
     </w:p>
     <w:tbl>
       <w:tblPr>
@@ -13227,11 +13432,11 @@
       <w:pPr>
         <w:pStyle w:val="Heading2"/>
       </w:pPr>
-      <w:bookmarkStart w:id="52" w:name="_Toc243744393"/>
+      <w:bookmarkStart w:id="54" w:name="_Toc243745042"/>
       <w:r>
         <w:t>3.12 Robustness and Seeding</w:t>
       </w:r>
-      <w:bookmarkEnd w:id="52"/>
+      <w:bookmarkEnd w:id="54"/>
     </w:p>
     <w:p>
       <w:r>
@@ -13260,11 +13465,11 @@
       <w:pPr>
         <w:pStyle w:val="Heading2"/>
       </w:pPr>
-      <w:bookmarkStart w:id="53" w:name="_Toc243744394"/>
+      <w:bookmarkStart w:id="55" w:name="_Toc243745043"/>
       <w:r>
         <w:t>3.13 Governance and Execution Boundaries</w:t>
       </w:r>
-      <w:bookmarkEnd w:id="53"/>
+      <w:bookmarkEnd w:id="55"/>
     </w:p>
     <w:p>
       <w:r>
@@ -13288,21 +13493,21 @@
       <w:pPr>
         <w:pStyle w:val="Heading1"/>
       </w:pPr>
-      <w:bookmarkStart w:id="54" w:name="_Toc243744395"/>
+      <w:bookmarkStart w:id="56" w:name="_Toc243745044"/>
       <w:r>
         <w:t>Chapter 4 Results</w:t>
       </w:r>
-      <w:bookmarkEnd w:id="54"/>
+      <w:bookmarkEnd w:id="56"/>
     </w:p>
     <w:p>
       <w:pPr>
         <w:pStyle w:val="Heading2"/>
       </w:pPr>
-      <w:bookmarkStart w:id="55" w:name="_Toc243744396"/>
+      <w:bookmarkStart w:id="57" w:name="_Toc243745045"/>
       <w:r>
         <w:t>4.1 Evidence Status</w:t>
       </w:r>
-      <w:bookmarkEnd w:id="55"/>
+      <w:bookmarkEnd w:id="57"/>
     </w:p>
     <w:p>
       <w:r>
@@ -13326,11 +13531,11 @@
       <w:pPr>
         <w:pStyle w:val="Heading2"/>
       </w:pPr>
-      <w:bookmarkStart w:id="56" w:name="_Toc243744397"/>
+      <w:bookmarkStart w:id="58" w:name="_Toc243745046"/>
       <w:r>
         <w:t>4.2 Recorded Exploratory Evidence</w:t>
       </w:r>
-      <w:bookmarkEnd w:id="56"/>
+      <w:bookmarkEnd w:id="58"/>
     </w:p>
     <w:p>
       <w:r>
@@ -13341,11 +13546,11 @@
       <w:pPr>
         <w:pStyle w:val="TableCaption"/>
       </w:pPr>
-      <w:bookmarkStart w:id="57" w:name="_Toc243744426"/>
+      <w:bookmarkStart w:id="59" w:name="_Toc243745075"/>
       <w:r>
         <w:t>Table 4.1 Recorded logistic exploratory results</w:t>
       </w:r>
-      <w:bookmarkEnd w:id="57"/>
+      <w:bookmarkEnd w:id="59"/>
     </w:p>
     <w:tbl>
       <w:tblPr>
@@ -13744,21 +13949,21 @@
       <w:pPr>
         <w:pStyle w:val="Heading2"/>
       </w:pPr>
-      <w:bookmarkStart w:id="58" w:name="_Toc243744398"/>
+      <w:bookmarkStart w:id="60" w:name="_Toc243745047"/>
       <w:r>
         <w:t>4.3 Formal Dataset and EDA</w:t>
       </w:r>
-      <w:bookmarkEnd w:id="58"/>
+      <w:bookmarkEnd w:id="60"/>
     </w:p>
     <w:p>
       <w:pPr>
         <w:pStyle w:val="TableCaption"/>
       </w:pPr>
-      <w:bookmarkStart w:id="59" w:name="_Toc243744427"/>
+      <w:bookmarkStart w:id="61" w:name="_Toc243745076"/>
       <w:r>
         <w:t>Table 4.2 Illustrative sample accounting</w:t>
       </w:r>
-      <w:bookmarkEnd w:id="59"/>
+      <w:bookmarkEnd w:id="61"/>
     </w:p>
     <w:tbl>
       <w:tblPr>
@@ -14407,11 +14612,11 @@
       <w:pPr>
         <w:pStyle w:val="TableCaption"/>
       </w:pPr>
-      <w:bookmarkStart w:id="60" w:name="_Toc243744428"/>
+      <w:bookmarkStart w:id="62" w:name="_Toc243745077"/>
       <w:r>
         <w:t>Table 4.3 EDA results awaiting collection</w:t>
       </w:r>
-      <w:bookmarkEnd w:id="60"/>
+      <w:bookmarkEnd w:id="62"/>
     </w:p>
     <w:tbl>
       <w:tblPr>
@@ -15105,21 +15310,21 @@
       <w:pPr>
         <w:pStyle w:val="Heading2"/>
       </w:pPr>
-      <w:bookmarkStart w:id="61" w:name="_Toc243744399"/>
+      <w:bookmarkStart w:id="63" w:name="_Toc243745048"/>
       <w:r>
         <w:t>4.4 Illustrative Model Comparison</w:t>
       </w:r>
-      <w:bookmarkEnd w:id="61"/>
+      <w:bookmarkEnd w:id="63"/>
     </w:p>
     <w:p>
       <w:pPr>
         <w:pStyle w:val="TableCaption"/>
       </w:pPr>
-      <w:bookmarkStart w:id="62" w:name="_Toc243744429"/>
+      <w:bookmarkStart w:id="64" w:name="_Toc243745078"/>
       <w:r>
         <w:t>Table 4.4 Illustrative locked model scores</w:t>
       </w:r>
-      <w:bookmarkEnd w:id="62"/>
+      <w:bookmarkEnd w:id="64"/>
     </w:p>
     <w:tbl>
       <w:tblPr>
@@ -16124,11 +16329,11 @@
       <w:pPr>
         <w:pStyle w:val="TableCaption"/>
       </w:pPr>
-      <w:bookmarkStart w:id="63" w:name="_Toc243744430"/>
+      <w:bookmarkStart w:id="65" w:name="_Toc243745079"/>
       <w:r>
         <w:t>Table 4.5 Illustrative SVM confusion matrix</w:t>
       </w:r>
-      <w:bookmarkEnd w:id="63"/>
+      <w:bookmarkEnd w:id="65"/>
     </w:p>
     <w:tbl>
       <w:tblPr>
@@ -16497,11 +16702,11 @@
       <w:pPr>
         <w:pStyle w:val="TableCaption"/>
       </w:pPr>
-      <w:bookmarkStart w:id="64" w:name="_Toc243744431"/>
+      <w:bookmarkStart w:id="66" w:name="_Toc243745080"/>
       <w:r>
         <w:t>Table 4.6 RQ1 feature ablation results</w:t>
       </w:r>
-      <w:bookmarkEnd w:id="64"/>
+      <w:bookmarkEnd w:id="66"/>
     </w:p>
     <w:tbl>
       <w:tblPr>
@@ -16949,11 +17154,11 @@
       <w:pPr>
         <w:pStyle w:val="TableCaption"/>
       </w:pPr>
-      <w:bookmarkStart w:id="65" w:name="_Toc243744432"/>
+      <w:bookmarkStart w:id="67" w:name="_Toc243745081"/>
       <w:r>
         <w:t>Table 4.7 RQ2 transfer and stability</w:t>
       </w:r>
-      <w:bookmarkEnd w:id="65"/>
+      <w:bookmarkEnd w:id="67"/>
     </w:p>
     <w:tbl>
       <w:tblPr>
@@ -17599,11 +17804,11 @@
       <w:pPr>
         <w:pStyle w:val="TableCaption"/>
       </w:pPr>
-      <w:bookmarkStart w:id="66" w:name="_Toc243744433"/>
+      <w:bookmarkStart w:id="68" w:name="_Toc243745082"/>
       <w:r>
         <w:t>Table 4.8 Illustrative SVM paired differences</w:t>
       </w:r>
-      <w:bookmarkEnd w:id="66"/>
+      <w:bookmarkEnd w:id="68"/>
     </w:p>
     <w:tbl>
       <w:tblPr>
@@ -18054,21 +18259,21 @@
       <w:pPr>
         <w:pStyle w:val="Heading2"/>
       </w:pPr>
-      <w:bookmarkStart w:id="67" w:name="_Toc243744400"/>
+      <w:bookmarkStart w:id="69" w:name="_Toc243745049"/>
       <w:r>
         <w:t>4.5 Robustness Calibration and Cost</w:t>
       </w:r>
-      <w:bookmarkEnd w:id="67"/>
+      <w:bookmarkEnd w:id="69"/>
     </w:p>
     <w:p>
       <w:pPr>
         <w:pStyle w:val="TableCaption"/>
       </w:pPr>
-      <w:bookmarkStart w:id="68" w:name="_Toc243744434"/>
+      <w:bookmarkStart w:id="70" w:name="_Toc243745083"/>
       <w:r>
         <w:t>Table 4.9 Required robustness results</w:t>
       </w:r>
-      <w:bookmarkEnd w:id="68"/>
+      <w:bookmarkEnd w:id="70"/>
     </w:p>
     <w:tbl>
       <w:tblPr>
@@ -18839,11 +19044,11 @@
       <w:pPr>
         <w:pStyle w:val="TableCaption"/>
       </w:pPr>
-      <w:bookmarkStart w:id="69" w:name="_Toc243744435"/>
+      <w:bookmarkStart w:id="71" w:name="_Toc243745084"/>
       <w:r>
         <w:t>Table 4.10 Calibration and resource outputs</w:t>
       </w:r>
-      <w:bookmarkEnd w:id="69"/>
+      <w:bookmarkEnd w:id="71"/>
     </w:p>
     <w:tbl>
       <w:tblPr>
@@ -19252,11 +19457,11 @@
       <w:pPr>
         <w:pStyle w:val="Heading2"/>
       </w:pPr>
-      <w:bookmarkStart w:id="70" w:name="_Toc243744401"/>
+      <w:bookmarkStart w:id="72" w:name="_Toc243745050"/>
       <w:r>
         <w:t>4.6 Hypothesis Status</w:t>
       </w:r>
-      <w:bookmarkEnd w:id="70"/>
+      <w:bookmarkEnd w:id="72"/>
     </w:p>
     <w:p>
       <w:r>
@@ -19272,21 +19477,21 @@
       <w:pPr>
         <w:pStyle w:val="Heading1"/>
       </w:pPr>
-      <w:bookmarkStart w:id="71" w:name="_Toc243744402"/>
+      <w:bookmarkStart w:id="73" w:name="_Toc243745051"/>
       <w:r>
         <w:t>Chapter 5 Discussion and Conclusions</w:t>
       </w:r>
-      <w:bookmarkEnd w:id="71"/>
+      <w:bookmarkEnd w:id="73"/>
     </w:p>
     <w:p>
       <w:pPr>
         <w:pStyle w:val="Heading2"/>
       </w:pPr>
-      <w:bookmarkStart w:id="72" w:name="_Toc243744403"/>
+      <w:bookmarkStart w:id="74" w:name="_Toc243745052"/>
       <w:r>
         <w:t>5.1 Interpretation Framework</w:t>
       </w:r>
-      <w:bookmarkEnd w:id="72"/>
+      <w:bookmarkEnd w:id="74"/>
     </w:p>
     <w:p>
       <w:r>
@@ -19302,11 +19507,11 @@
       <w:pPr>
         <w:pStyle w:val="Heading2"/>
       </w:pPr>
-      <w:bookmarkStart w:id="73" w:name="_Toc243744404"/>
+      <w:bookmarkStart w:id="75" w:name="_Toc243745053"/>
       <w:r>
         <w:t>5.2 Conditional Discussion</w:t>
       </w:r>
-      <w:bookmarkEnd w:id="73"/>
+      <w:bookmarkEnd w:id="75"/>
     </w:p>
     <w:p>
       <w:r>
@@ -19344,11 +19549,11 @@
       <w:pPr>
         <w:pStyle w:val="Heading2"/>
       </w:pPr>
-      <w:bookmarkStart w:id="74" w:name="_Toc243744405"/>
+      <w:bookmarkStart w:id="76" w:name="_Toc243745054"/>
       <w:r>
         <w:t>5.3 Conclusions</w:t>
       </w:r>
-      <w:bookmarkEnd w:id="74"/>
+      <w:bookmarkEnd w:id="76"/>
     </w:p>
     <w:p>
       <w:r>
@@ -19367,11 +19572,11 @@
       <w:pPr>
         <w:pStyle w:val="Heading2"/>
       </w:pPr>
-      <w:bookmarkStart w:id="75" w:name="_Toc243744406"/>
+      <w:bookmarkStart w:id="77" w:name="_Toc243745055"/>
       <w:r>
         <w:t>5.4 Contributions to Knowledge</w:t>
       </w:r>
-      <w:bookmarkEnd w:id="75"/>
+      <w:bookmarkEnd w:id="77"/>
     </w:p>
     <w:p>
       <w:r>
@@ -19384,14 +19589,19 @@
       </w:r>
     </w:p>
     <w:p>
+      <w:r>
+        <w:t>For my Army Cyber motivation, the practical value of this work will be whether its validated features and limitations help SOC analysts and CPT members reason about APT-like activity. Any operational use would require testing in representative environments, review of human false-AI labels and missed AI activity, and integration with existing analyst judgment. The present laboratory study is a step toward that objective; its operational benefit remains to be demonstrated.</w:t>
+      </w:r>
+    </w:p>
+    <w:p>
       <w:pPr>
         <w:pStyle w:val="Heading2"/>
       </w:pPr>
-      <w:bookmarkStart w:id="76" w:name="_Toc243744407"/>
+      <w:bookmarkStart w:id="78" w:name="_Toc243745056"/>
       <w:r>
         <w:t>5.5 Limitations and Future Work</w:t>
       </w:r>
-      <w:bookmarkEnd w:id="76"/>
+      <w:bookmarkEnd w:id="78"/>
     </w:p>
     <w:p>
       <w:r>
@@ -19407,11 +19617,11 @@
       <w:pPr>
         <w:pStyle w:val="Heading2"/>
       </w:pPr>
-      <w:bookmarkStart w:id="77" w:name="_Toc243744408"/>
+      <w:bookmarkStart w:id="79" w:name="_Toc243745057"/>
       <w:r>
         <w:t>5.6 Completion and Publication</w:t>
       </w:r>
-      <w:bookmarkEnd w:id="77"/>
+      <w:bookmarkEnd w:id="79"/>
     </w:p>
     <w:p>
       <w:r>
@@ -19427,11 +19637,11 @@
       <w:pPr>
         <w:pStyle w:val="Heading1"/>
       </w:pPr>
-      <w:bookmarkStart w:id="78" w:name="_Toc243744409"/>
+      <w:bookmarkStart w:id="80" w:name="_Toc243745058"/>
       <w:r>
         <w:t>References</w:t>
       </w:r>
-      <w:bookmarkEnd w:id="78"/>
+      <w:bookmarkEnd w:id="80"/>
     </w:p>
     <w:p>
       <w:pPr>
@@ -20036,21 +20246,21 @@
       <w:pPr>
         <w:pStyle w:val="Heading1"/>
       </w:pPr>
-      <w:bookmarkStart w:id="79" w:name="_Toc243744410"/>
+      <w:bookmarkStart w:id="81" w:name="_Toc243745059"/>
       <w:r>
         <w:t>Appendix A Replacement Register</w:t>
       </w:r>
-      <w:bookmarkEnd w:id="79"/>
+      <w:bookmarkEnd w:id="81"/>
     </w:p>
     <w:p>
       <w:pPr>
         <w:pStyle w:val="TableCaption"/>
       </w:pPr>
-      <w:bookmarkStart w:id="80" w:name="_Toc243744436"/>
+      <w:bookmarkStart w:id="82" w:name="_Toc243745085"/>
       <w:r>
         <w:t>Table A.1 Evidence inputs for revision</w:t>
       </w:r>
-      <w:bookmarkEnd w:id="80"/>
+      <w:bookmarkEnd w:id="82"/>
     </w:p>
     <w:tbl>
       <w:tblPr>
@@ -20754,11 +20964,11 @@
       <w:pPr>
         <w:pStyle w:val="Heading1"/>
       </w:pPr>
-      <w:bookmarkStart w:id="81" w:name="_Toc243744411"/>
+      <w:bookmarkStart w:id="83" w:name="_Toc243745060"/>
       <w:r>
         <w:t>Appendix B Reproducibility Manifest</w:t>
       </w:r>
-      <w:bookmarkEnd w:id="81"/>
+      <w:bookmarkEnd w:id="83"/>
     </w:p>
     <w:p>
       <w:r>
@@ -20784,11 +20994,11 @@
       <w:pPr>
         <w:pStyle w:val="Heading1"/>
       </w:pPr>
-      <w:bookmarkStart w:id="82" w:name="_Toc243744412"/>
+      <w:bookmarkStart w:id="84" w:name="_Toc243745061"/>
       <w:r>
         <w:t>Appendix C Literature Update and Formatting Record</w:t>
       </w:r>
-      <w:bookmarkEnd w:id="82"/>
+      <w:bookmarkEnd w:id="84"/>
     </w:p>
     <w:p>
       <w:r>
@@ -20797,10 +21007,10 @@
     </w:p>
     <w:p>
       <w:r>
-        <w:t>This working paper uses the official 2026 GW online D.Eng. Praxis template as its style source: Letter pages, 1.25-inch left/right margins, 1-inch top/bottom margins, Times New Roman, 1.5 body spacing, roman preliminary pages and Arabic body numbering. Optional dedication/acknowledgments were omitted. The pending certification wording and red draft annotations are deliberate working-paper deviations. They must be replaced by approved information for the submission copy (The George Washington University, 202</w:t>
-      </w:r>
-      <w:r>
-        <w:t>5, 2026, n.d.).</w:t>
+        <w:t>This working paper uses the official 2026 GW online D.Eng. Praxis template as its style source: Letter pages, 1.25-inch left/right margins, 1-inch top/bottom margins, Times New Roman, 1.5 body spacing, roman preliminary pages and Arabic body numbering. The dedication and acknowledgments preserve the author’s personal context from the earlier GML paper, with Dr. Phillip Reed and Austin Welborn added at the author’s request. The pending certification wording and red draft annotations are deliberate working-pa</w:t>
+      </w:r>
+      <w:r>
+        <w:t>per deviations. They must be replaced by approved information for the submission copy (The George Washington University, 2025, 2026, n.d.).</w:t>
       </w:r>
     </w:p>
     <w:p>
@@ -20812,11 +21022,11 @@
       <w:pPr>
         <w:pStyle w:val="Heading1"/>
       </w:pPr>
-      <w:bookmarkStart w:id="83" w:name="_Toc243744413"/>
+      <w:bookmarkStart w:id="85" w:name="_Toc243745062"/>
       <w:r>
         <w:t>Appendix D October 24 Implementation Record</w:t>
       </w:r>
-      <w:bookmarkEnd w:id="83"/>
+      <w:bookmarkEnd w:id="85"/>
     </w:p>
     <w:p>
       <w:r>
@@ -20855,11 +21065,11 @@
       <w:pPr>
         <w:pStyle w:val="TableCaption"/>
       </w:pPr>
-      <w:bookmarkStart w:id="84" w:name="_Toc243744437"/>
+      <w:bookmarkStart w:id="86" w:name="_Toc243745086"/>
       <w:r>
         <w:t>Table D.1 Implementation evidence and unresolved gates</w:t>
       </w:r>
-      <w:bookmarkEnd w:id="84"/>
+      <w:bookmarkEnd w:id="86"/>
     </w:p>
     <w:tbl>
       <w:tblPr>

</xml_diff>